<commit_message>
Add CV PDF and update DOCX to November 2024 version
Co-Authored-By: Claude Sonnet 4.6 <noreply@anthropic.com>
</commit_message>
<xml_diff>
--- a/public/cv.docx
+++ b/public/cv.docx
@@ -1,6 +1,6 @@
 
 <file path=word/document.xml><?xml version="1.0" encoding="utf-8"?>
-<w:document xmlns:wpc="http://schemas.microsoft.com/office/word/2010/wordprocessingCanvas" xmlns:cx="http://schemas.microsoft.com/office/drawing/2014/chartex" xmlns:cx1="http://schemas.microsoft.com/office/drawing/2015/9/8/chartex" xmlns:cx2="http://schemas.microsoft.com/office/drawing/2015/10/21/chartex" xmlns:cx3="http://schemas.microsoft.com/office/drawing/2016/5/9/chartex" xmlns:cx4="http://schemas.microsoft.com/office/drawing/2016/5/10/chartex" xmlns:cx5="http://schemas.microsoft.com/office/drawing/2016/5/11/chartex" xmlns:cx6="http://schemas.microsoft.com/office/drawing/2016/5/12/chartex" xmlns:cx7="http://schemas.microsoft.com/office/drawing/2016/5/13/chartex" xmlns:cx8="http://schemas.microsoft.com/office/drawing/2016/5/14/chartex" xmlns:mc="http://schemas.openxmlformats.org/markup-compatibility/2006" xmlns:aink="http://schemas.microsoft.com/office/drawing/2016/ink" xmlns:am3d="http://schemas.microsoft.com/office/drawing/2017/model3d" xmlns:o="urn:schemas-microsoft-com:office:office" xmlns:oel="http://schemas.microsoft.com/office/2019/extlst" xmlns:r="http://schemas.openxmlformats.org/officeDocument/2006/relationships" xmlns:m="http://schemas.openxmlformats.org/officeDocument/2006/math" xmlns:v="urn:schemas-microsoft-com:vml" xmlns:wp14="http://schemas.microsoft.com/office/word/2010/wordprocessingDrawing" xmlns:wp="http://schemas.openxmlformats.org/drawingml/2006/wordprocessingDrawing" xmlns:w10="urn:schemas-microsoft-com:office:word" xmlns:w="http://schemas.openxmlformats.org/wordprocessingml/2006/main" xmlns:w14="http://schemas.microsoft.com/office/word/2010/wordml" xmlns:w15="http://schemas.microsoft.com/office/word/2012/wordml" xmlns:w16cex="http://schemas.microsoft.com/office/word/2018/wordml/cex" xmlns:w16cid="http://schemas.microsoft.com/office/word/2016/wordml/cid" xmlns:w16="http://schemas.microsoft.com/office/word/2018/wordml" xmlns:w16du="http://schemas.microsoft.com/office/word/2023/wordml/word16du" xmlns:w16sdtdh="http://schemas.microsoft.com/office/word/2020/wordml/sdtdatahash" xmlns:w16sdtfl="http://schemas.microsoft.com/office/word/2024/wordml/sdtformatlock" xmlns:w16se="http://schemas.microsoft.com/office/word/2015/wordml/symex" xmlns:wpg="http://schemas.microsoft.com/office/word/2010/wordprocessingGroup" xmlns:wpi="http://schemas.microsoft.com/office/word/2010/wordprocessingInk" xmlns:wne="http://schemas.microsoft.com/office/word/2006/wordml" xmlns:wps="http://schemas.microsoft.com/office/word/2010/wordprocessingShape" mc:Ignorable="w14 w15 w16se w16cid w16 w16cex w16sdtdh w16sdtfl w16du wp14">
+<w:document xmlns:wpc="http://schemas.microsoft.com/office/word/2010/wordprocessingCanvas" xmlns:cx="http://schemas.microsoft.com/office/drawing/2014/chartex" xmlns:cx1="http://schemas.microsoft.com/office/drawing/2015/9/8/chartex" xmlns:cx2="http://schemas.microsoft.com/office/drawing/2015/10/21/chartex" xmlns:cx3="http://schemas.microsoft.com/office/drawing/2016/5/9/chartex" xmlns:cx4="http://schemas.microsoft.com/office/drawing/2016/5/10/chartex" xmlns:cx5="http://schemas.microsoft.com/office/drawing/2016/5/11/chartex" xmlns:cx6="http://schemas.microsoft.com/office/drawing/2016/5/12/chartex" xmlns:cx7="http://schemas.microsoft.com/office/drawing/2016/5/13/chartex" xmlns:cx8="http://schemas.microsoft.com/office/drawing/2016/5/14/chartex" xmlns:mc="http://schemas.openxmlformats.org/markup-compatibility/2006" xmlns:aink="http://schemas.microsoft.com/office/drawing/2016/ink" xmlns:am3d="http://schemas.microsoft.com/office/drawing/2017/model3d" xmlns:o="urn:schemas-microsoft-com:office:office" xmlns:oel="http://schemas.microsoft.com/office/2019/extlst" xmlns:r="http://schemas.openxmlformats.org/officeDocument/2006/relationships" xmlns:m="http://schemas.openxmlformats.org/officeDocument/2006/math" xmlns:v="urn:schemas-microsoft-com:vml" xmlns:wp14="http://schemas.microsoft.com/office/word/2010/wordprocessingDrawing" xmlns:wp="http://schemas.openxmlformats.org/drawingml/2006/wordprocessingDrawing" xmlns:w10="urn:schemas-microsoft-com:office:word" xmlns:w="http://schemas.openxmlformats.org/wordprocessingml/2006/main" xmlns:w14="http://schemas.microsoft.com/office/word/2010/wordml" xmlns:w15="http://schemas.microsoft.com/office/word/2012/wordml" xmlns:w16cex="http://schemas.microsoft.com/office/word/2018/wordml/cex" xmlns:w16cid="http://schemas.microsoft.com/office/word/2016/wordml/cid" xmlns:w16="http://schemas.microsoft.com/office/word/2018/wordml" xmlns:w16du="http://schemas.microsoft.com/office/word/2023/wordml/word16du" xmlns:w16sdtdh="http://schemas.microsoft.com/office/word/2020/wordml/sdtdatahash" xmlns:w16se="http://schemas.microsoft.com/office/word/2015/wordml/symex" xmlns:wpg="http://schemas.microsoft.com/office/word/2010/wordprocessingGroup" xmlns:wpi="http://schemas.microsoft.com/office/word/2010/wordprocessingInk" xmlns:wne="http://schemas.microsoft.com/office/word/2006/wordml" xmlns:wps="http://schemas.microsoft.com/office/word/2010/wordprocessingShape" mc:Ignorable="w14 w15 w16se w16cid w16 w16cex w16sdtdh w16du wp14">
   <w:body>
     <w:p>
       <w:pPr>
@@ -188,7 +188,7 @@
           <w:b/>
           <w:bCs/>
         </w:rPr>
-        <w:t xml:space="preserve">2020 - </w:t>
+        <w:t xml:space="preserve">2020 - Present | Ph.D. Candidate </w:t>
       </w:r>
       <w:r>
         <w:rPr>
@@ -196,7 +196,7 @@
           <w:b/>
           <w:bCs/>
         </w:rPr>
-        <w:t>2024</w:t>
+        <w:t>in</w:t>
       </w:r>
       <w:r>
         <w:rPr>
@@ -204,7 +204,7 @@
           <w:b/>
           <w:bCs/>
         </w:rPr>
-        <w:t xml:space="preserve"> | Ph.D. </w:t>
+        <w:t xml:space="preserve"> Political Science at Yonsei University, South Korea</w:t>
       </w:r>
       <w:r>
         <w:rPr>
@@ -212,7 +212,7 @@
           <w:b/>
           <w:bCs/>
         </w:rPr>
-        <w:t>in</w:t>
+        <w:t xml:space="preserve"> </w:t>
       </w:r>
       <w:r>
         <w:rPr>
@@ -220,50 +220,26 @@
           <w:b/>
           <w:bCs/>
         </w:rPr>
-        <w:t xml:space="preserve"> Political Science at Yonsei University, South Korea</w:t>
-      </w:r>
-      <w:r>
+        <w:t>(Preliminary Exam Passed, Final Defense Scheduled)</w:t>
+      </w:r>
+    </w:p>
+    <w:p>
+      <w:pPr>
+        <w:pStyle w:val="a5"/>
+        <w:ind w:leftChars="0" w:left="400" w:firstLine="400"/>
         <w:rPr>
           <w:rFonts w:ascii="Times New Roman" w:hAnsi="Times New Roman"/>
           <w:b/>
           <w:bCs/>
         </w:rPr>
-        <w:t xml:space="preserve"> </w:t>
-      </w:r>
-    </w:p>
-    <w:p>
-      <w:pPr>
-        <w:pStyle w:val="a5"/>
-        <w:ind w:leftChars="0" w:left="400" w:firstLine="400"/>
+      </w:pPr>
+      <w:r>
         <w:rPr>
           <w:rFonts w:ascii="Times New Roman" w:hAnsi="Times New Roman"/>
           <w:b/>
           <w:bCs/>
         </w:rPr>
-      </w:pPr>
-      <w:r>
-        <w:rPr>
-          <w:rFonts w:ascii="Times New Roman" w:hAnsi="Times New Roman"/>
-          <w:b/>
-          <w:bCs/>
-        </w:rPr>
-        <w:t xml:space="preserve">Thesis Title: The Politics of Death: </w:t>
-      </w:r>
-      <w:r>
-        <w:rPr>
-          <w:rFonts w:ascii="Times New Roman" w:hAnsi="Times New Roman"/>
-          <w:b/>
-          <w:bCs/>
-        </w:rPr>
-        <w:t xml:space="preserve">Performances of the State, Memory, and the National in </w:t>
-      </w:r>
-      <w:r>
-        <w:rPr>
-          <w:rFonts w:ascii="Times New Roman" w:hAnsi="Times New Roman"/>
-          <w:b/>
-          <w:bCs/>
-        </w:rPr>
-        <w:t>South Korea</w:t>
+        <w:t>Thesis Title: The Politics of Death: On Performative Memory and Making of South Koreans</w:t>
       </w:r>
     </w:p>
     <w:p>
@@ -290,8 +266,7 @@
         <w:pStyle w:val="a5"/>
         <w:ind w:leftChars="0"/>
         <w:rPr>
-          <w:rFonts w:ascii="Times New Roman" w:hAnsi="Times New Roman" w:hint="eastAsia"/>
-          <w:lang w:eastAsia="ko-KR"/>
+          <w:rFonts w:ascii="Times New Roman" w:hAnsi="Times New Roman"/>
         </w:rPr>
       </w:pPr>
       <w:r>
@@ -546,14 +521,7 @@
         <w:rPr>
           <w:rFonts w:ascii="Times New Roman" w:hAnsi="Times New Roman"/>
         </w:rPr>
-        <w:t>202</w:t>
-      </w:r>
-      <w:r>
-        <w:rPr>
-          <w:rFonts w:ascii="Times New Roman" w:hAnsi="Times New Roman" w:hint="eastAsia"/>
-          <w:lang w:eastAsia="ko-KR"/>
-        </w:rPr>
-        <w:t>4</w:t>
+        <w:t>2023</w:t>
       </w:r>
       <w:r>
         <w:rPr>
@@ -891,196 +859,6 @@
     </w:p>
     <w:p>
       <w:pPr>
-        <w:pStyle w:val="zfr3q"/>
-        <w:numPr>
-          <w:ilvl w:val="0"/>
-          <w:numId w:val="10"/>
-        </w:numPr>
-        <w:spacing w:before="0" w:beforeAutospacing="0" w:after="0" w:afterAutospacing="0"/>
-        <w:rPr>
-          <w:rFonts w:ascii="Times New Roman" w:hAnsi="Times New Roman" w:cs="Times New Roman"/>
-          <w:color w:val="212121"/>
-          <w:sz w:val="21"/>
-          <w:szCs w:val="21"/>
-        </w:rPr>
-      </w:pPr>
-      <w:r>
-        <w:rPr>
-          <w:rStyle w:val="c9dxtc"/>
-          <w:rFonts w:ascii="Times New Roman" w:hAnsi="Times New Roman" w:cs="Times New Roman"/>
-          <w:color w:val="000000"/>
-          <w:sz w:val="21"/>
-          <w:szCs w:val="21"/>
-        </w:rPr>
-        <w:t>Jul. 2023 | Presenter, "The Nationalist Manhood and War Widows in the National Cemetery", The Word Congress for Korean Politics and Society, The Korean Political Science Association, Yonsei University</w:t>
-      </w:r>
-    </w:p>
-    <w:p>
-      <w:pPr>
-        <w:pStyle w:val="zfr3q"/>
-        <w:numPr>
-          <w:ilvl w:val="0"/>
-          <w:numId w:val="10"/>
-        </w:numPr>
-        <w:spacing w:before="0" w:beforeAutospacing="0" w:after="0" w:afterAutospacing="0"/>
-        <w:rPr>
-          <w:rFonts w:ascii="Times New Roman" w:hAnsi="Times New Roman" w:cs="Times New Roman"/>
-          <w:color w:val="212121"/>
-          <w:sz w:val="21"/>
-          <w:szCs w:val="21"/>
-        </w:rPr>
-      </w:pPr>
-      <w:r>
-        <w:rPr>
-          <w:rStyle w:val="c9dxtc"/>
-          <w:rFonts w:ascii="Times New Roman" w:hAnsi="Times New Roman" w:cs="Times New Roman"/>
-          <w:color w:val="000000"/>
-          <w:sz w:val="21"/>
-          <w:szCs w:val="21"/>
-        </w:rPr>
-        <w:t xml:space="preserve">Jan. 2023 | Presenter, "Reframing Nationalist Manhood in the National Cemetery, South Korea", Collaboration Workshop, Global Affairs Research Centre, </w:t>
-      </w:r>
-      <w:proofErr w:type="spellStart"/>
-      <w:r>
-        <w:rPr>
-          <w:rStyle w:val="c9dxtc"/>
-          <w:rFonts w:ascii="Times New Roman" w:hAnsi="Times New Roman" w:cs="Times New Roman"/>
-          <w:color w:val="000000"/>
-          <w:sz w:val="21"/>
-          <w:szCs w:val="21"/>
-        </w:rPr>
-        <w:t>Ryukoku</w:t>
-      </w:r>
-      <w:proofErr w:type="spellEnd"/>
-      <w:r>
-        <w:rPr>
-          <w:rStyle w:val="c9dxtc"/>
-          <w:rFonts w:ascii="Times New Roman" w:hAnsi="Times New Roman" w:cs="Times New Roman"/>
-          <w:color w:val="000000"/>
-          <w:sz w:val="21"/>
-          <w:szCs w:val="21"/>
-        </w:rPr>
-        <w:t xml:space="preserve"> University &amp; Critical Approaches to Political Science Lab, Department of Political Science, Yonsei University</w:t>
-      </w:r>
-    </w:p>
-    <w:p>
-      <w:pPr>
-        <w:pStyle w:val="zfr3q"/>
-        <w:numPr>
-          <w:ilvl w:val="0"/>
-          <w:numId w:val="10"/>
-        </w:numPr>
-        <w:spacing w:before="0" w:beforeAutospacing="0" w:after="0" w:afterAutospacing="0"/>
-        <w:rPr>
-          <w:rFonts w:ascii="Times New Roman" w:hAnsi="Times New Roman" w:cs="Times New Roman"/>
-          <w:color w:val="212121"/>
-          <w:sz w:val="21"/>
-          <w:szCs w:val="21"/>
-        </w:rPr>
-      </w:pPr>
-      <w:r>
-        <w:rPr>
-          <w:rStyle w:val="c9dxtc"/>
-          <w:rFonts w:ascii="Times New Roman" w:hAnsi="Times New Roman" w:cs="Times New Roman"/>
-          <w:color w:val="000000"/>
-          <w:sz w:val="21"/>
-          <w:szCs w:val="21"/>
-        </w:rPr>
-        <w:t>Jan. 2023 | Presenter, "Reframing Nationalist Manhood in the National Cemetery", the 35</w:t>
-      </w:r>
-      <w:r>
-        <w:rPr>
-          <w:rStyle w:val="c9dxtc"/>
-          <w:rFonts w:ascii="Times New Roman" w:hAnsi="Times New Roman" w:cs="Times New Roman"/>
-          <w:color w:val="000000"/>
-          <w:sz w:val="21"/>
-          <w:szCs w:val="21"/>
-          <w:vertAlign w:val="superscript"/>
-        </w:rPr>
-        <w:t>th</w:t>
-      </w:r>
-      <w:r>
-        <w:rPr>
-          <w:rStyle w:val="c9dxtc"/>
-          <w:rFonts w:ascii="Times New Roman" w:hAnsi="Times New Roman" w:cs="Times New Roman"/>
-          <w:color w:val="000000"/>
-          <w:sz w:val="21"/>
-          <w:szCs w:val="21"/>
-        </w:rPr>
-        <w:t> </w:t>
-      </w:r>
-      <w:proofErr w:type="spellStart"/>
-      <w:r>
-        <w:rPr>
-          <w:rStyle w:val="c9dxtc"/>
-          <w:rFonts w:ascii="Times New Roman" w:hAnsi="Times New Roman" w:cs="Times New Roman"/>
-          <w:color w:val="000000"/>
-          <w:sz w:val="21"/>
-          <w:szCs w:val="21"/>
-        </w:rPr>
-        <w:t>Sogang</w:t>
-      </w:r>
-      <w:proofErr w:type="spellEnd"/>
-      <w:r>
-        <w:rPr>
-          <w:rStyle w:val="c9dxtc"/>
-          <w:rFonts w:ascii="Times New Roman" w:hAnsi="Times New Roman" w:cs="Times New Roman"/>
-          <w:color w:val="000000"/>
-          <w:sz w:val="21"/>
-          <w:szCs w:val="21"/>
-        </w:rPr>
-        <w:t>-EWHA-Yonsei University Memory Research Seminar [in Korean]</w:t>
-      </w:r>
-    </w:p>
-    <w:p>
-      <w:pPr>
-        <w:pStyle w:val="zfr3q"/>
-        <w:numPr>
-          <w:ilvl w:val="0"/>
-          <w:numId w:val="10"/>
-        </w:numPr>
-        <w:spacing w:before="0" w:beforeAutospacing="0" w:after="0" w:afterAutospacing="0"/>
-        <w:rPr>
-          <w:rFonts w:ascii="Times New Roman" w:hAnsi="Times New Roman" w:cs="Times New Roman"/>
-          <w:color w:val="212121"/>
-          <w:sz w:val="21"/>
-          <w:szCs w:val="21"/>
-        </w:rPr>
-      </w:pPr>
-      <w:r>
-        <w:rPr>
-          <w:rStyle w:val="c9dxtc"/>
-          <w:rFonts w:ascii="Times New Roman" w:hAnsi="Times New Roman" w:cs="Times New Roman"/>
-          <w:color w:val="000000"/>
-          <w:sz w:val="21"/>
-          <w:szCs w:val="21"/>
-        </w:rPr>
-        <w:t>Apr. 2022 | Presenter, "Citizenship Practices of Korean Chinese Married Migrant Women in South Korea: Moderating Effects of Country of Origin in the Relationship Between Social Status and Life Satisfaction", The 79</w:t>
-      </w:r>
-      <w:r>
-        <w:rPr>
-          <w:rStyle w:val="c9dxtc"/>
-          <w:rFonts w:ascii="Times New Roman" w:hAnsi="Times New Roman" w:cs="Times New Roman"/>
-          <w:color w:val="000000"/>
-          <w:sz w:val="21"/>
-          <w:szCs w:val="21"/>
-          <w:vertAlign w:val="superscript"/>
-        </w:rPr>
-        <w:t>th</w:t>
-      </w:r>
-      <w:r>
-        <w:rPr>
-          <w:rStyle w:val="c9dxtc"/>
-          <w:rFonts w:ascii="Times New Roman" w:hAnsi="Times New Roman" w:cs="Times New Roman"/>
-          <w:color w:val="000000"/>
-          <w:sz w:val="21"/>
-          <w:szCs w:val="21"/>
-        </w:rPr>
-        <w:t> Annual Midwest Political Science Association Conference </w:t>
-      </w:r>
-    </w:p>
-    <w:p>
-      <w:pPr>
         <w:pStyle w:val="a5"/>
         <w:numPr>
           <w:ilvl w:val="0"/>
@@ -1159,7 +937,6 @@
         <w:rPr>
           <w:rFonts w:ascii="Times New Roman" w:hAnsi="Times New Roman"/>
         </w:rPr>
-        <w:lastRenderedPageBreak/>
         <w:t>Aug. 2020 | Debater, "Risk and Opportunity of National Cemetery." Policy Debate: Yesterday, Today, and Tomorrow of Korean National Cemetery, Co-hosted by Citizen's Solidarity for Human Rights and Min Hyeong-bae's National Assembly Office [in Korean]</w:t>
       </w:r>
     </w:p>
@@ -1223,7 +1000,7 @@
     <w:p>
       <w:pPr>
         <w:rPr>
-          <w:rFonts w:ascii="Times New Roman" w:hAnsi="Times New Roman"/>
+          <w:rFonts w:ascii="Times New Roman" w:hAnsi="Times New Roman" w:hint="eastAsia"/>
           <w:lang w:eastAsia="ko-KR"/>
         </w:rPr>
       </w:pPr>
@@ -1270,7 +1047,19 @@
         <w:rPr>
           <w:rFonts w:ascii="Times New Roman" w:hAnsi="Times New Roman"/>
         </w:rPr>
-        <w:t xml:space="preserve">Jun. 2024 - May 2025 | Humanities and Social Sciences Academic Research Professor Type B, National Research Foundation of Korea, "Rituals Memorizing Presidents’ Death and Being the South Korean: Focusing on Lee Syngman, Park </w:t>
+        <w:t xml:space="preserve">Jun. 2024 - May 2025 | Humanities and Social Sciences Academic Research Professor </w:t>
+      </w:r>
+      <w:r>
+        <w:rPr>
+          <w:rFonts w:ascii="Times New Roman" w:hAnsi="Times New Roman"/>
+        </w:rPr>
+        <w:t>Type</w:t>
+      </w:r>
+      <w:r>
+        <w:rPr>
+          <w:rFonts w:ascii="Times New Roman" w:hAnsi="Times New Roman"/>
+        </w:rPr>
+        <w:t xml:space="preserve"> B, National Research Foundation of Korea, "Rituals Memorizing Presidents’ Death and Being the South Korean: Focusing on Lee Syngman, Park </w:t>
       </w:r>
       <w:proofErr w:type="spellStart"/>
       <w:r>
@@ -1284,20 +1073,14 @@
         <w:rPr>
           <w:rFonts w:ascii="Times New Roman" w:hAnsi="Times New Roman"/>
         </w:rPr>
-        <w:t>, and Roh Moo</w:t>
-      </w:r>
-      <w:r>
-        <w:rPr>
-          <w:rFonts w:ascii="Times New Roman" w:hAnsi="Times New Roman"/>
-        </w:rPr>
-        <w:t>-</w:t>
+        <w:t xml:space="preserve">, and Roh </w:t>
       </w:r>
       <w:proofErr w:type="spellStart"/>
       <w:r>
         <w:rPr>
           <w:rFonts w:ascii="Times New Roman" w:hAnsi="Times New Roman"/>
         </w:rPr>
-        <w:t>hyun's</w:t>
+        <w:t>Moohyun's</w:t>
       </w:r>
       <w:proofErr w:type="spellEnd"/>
       <w:r>
@@ -1323,7 +1106,19 @@
         <w:rPr>
           <w:rFonts w:ascii="Times New Roman" w:hAnsi="Times New Roman"/>
         </w:rPr>
-        <w:t>Sep. 2023 - Aug. 2024 | Humanities and Social Sciences Academic Research Professor Type B, National Research Foundation of Korea, "The Making of the South Korean by Deaths"</w:t>
+        <w:t xml:space="preserve">Sep. 2023 - Aug. 2024 | Humanities and Social Sciences Academic Research Professor </w:t>
+      </w:r>
+      <w:r>
+        <w:rPr>
+          <w:rFonts w:ascii="Times New Roman" w:hAnsi="Times New Roman"/>
+        </w:rPr>
+        <w:t>Type</w:t>
+      </w:r>
+      <w:r>
+        <w:rPr>
+          <w:rFonts w:ascii="Times New Roman" w:hAnsi="Times New Roman"/>
+        </w:rPr>
+        <w:t xml:space="preserve"> B, National Research Foundation of Korea, "The Making of the South Korean by Deaths"</w:t>
       </w:r>
     </w:p>
     <w:p>
@@ -1342,7 +1137,19 @@
         <w:rPr>
           <w:rFonts w:ascii="Times New Roman" w:hAnsi="Times New Roman"/>
         </w:rPr>
-        <w:t>Sep. 2022 - Aug. 2023 | Humanities and Social Sciences Academic Research Professor Type B, National Research Foundation of Korea, "Lived Citizenship of Married Migrant Women in South Korea: The Interaction Effect of Birth-Nation and Class-Consciousness"</w:t>
+        <w:t xml:space="preserve">Sep. 2022 - Aug. 2023 | Humanities and Social Sciences Academic Research Professor </w:t>
+      </w:r>
+      <w:r>
+        <w:rPr>
+          <w:rFonts w:ascii="Times New Roman" w:hAnsi="Times New Roman"/>
+        </w:rPr>
+        <w:t>Type</w:t>
+      </w:r>
+      <w:r>
+        <w:rPr>
+          <w:rFonts w:ascii="Times New Roman" w:hAnsi="Times New Roman"/>
+        </w:rPr>
+        <w:t xml:space="preserve"> B, National Research Foundation of Korea, "Lived Citizenship of Married Migrant Women in South Korea: The Interaction Effect of Birth-Nation and Class-Consciousness"</w:t>
       </w:r>
     </w:p>
     <w:p>
@@ -1389,37 +1196,7 @@
         <w:rPr>
           <w:rFonts w:ascii="Times New Roman" w:hAnsi="Times New Roman"/>
         </w:rPr>
-        <w:t xml:space="preserve">Updated: </w:t>
-      </w:r>
-      <w:r>
-        <w:rPr>
-          <w:rFonts w:ascii="Times New Roman" w:hAnsi="Times New Roman"/>
-        </w:rPr>
-        <w:t>Feb</w:t>
-      </w:r>
-      <w:r>
-        <w:rPr>
-          <w:rFonts w:ascii="Times New Roman" w:hAnsi="Times New Roman"/>
-        </w:rPr>
-        <w:t xml:space="preserve">. </w:t>
-      </w:r>
-      <w:r>
-        <w:rPr>
-          <w:rFonts w:ascii="Times New Roman" w:hAnsi="Times New Roman"/>
-        </w:rPr>
-        <w:t>1</w:t>
-      </w:r>
-      <w:r>
-        <w:rPr>
-          <w:rFonts w:ascii="Times New Roman" w:hAnsi="Times New Roman"/>
-        </w:rPr>
-        <w:t>, 202</w:t>
-      </w:r>
-      <w:r>
-        <w:rPr>
-          <w:rFonts w:ascii="Times New Roman" w:hAnsi="Times New Roman"/>
-        </w:rPr>
-        <w:t>5</w:t>
+        <w:t>Updated: Nov. 11, 2024</w:t>
       </w:r>
     </w:p>
     <w:sectPr>
@@ -1435,7 +1212,7 @@
 </file>
 
 <file path=word/endnotes.xml><?xml version="1.0" encoding="utf-8"?>
-<w:endnotes xmlns:wpc="http://schemas.microsoft.com/office/word/2010/wordprocessingCanvas" xmlns:cx="http://schemas.microsoft.com/office/drawing/2014/chartex" xmlns:cx1="http://schemas.microsoft.com/office/drawing/2015/9/8/chartex" xmlns:cx2="http://schemas.microsoft.com/office/drawing/2015/10/21/chartex" xmlns:cx3="http://schemas.microsoft.com/office/drawing/2016/5/9/chartex" xmlns:cx4="http://schemas.microsoft.com/office/drawing/2016/5/10/chartex" xmlns:cx5="http://schemas.microsoft.com/office/drawing/2016/5/11/chartex" xmlns:cx6="http://schemas.microsoft.com/office/drawing/2016/5/12/chartex" xmlns:cx7="http://schemas.microsoft.com/office/drawing/2016/5/13/chartex" xmlns:cx8="http://schemas.microsoft.com/office/drawing/2016/5/14/chartex" xmlns:mc="http://schemas.openxmlformats.org/markup-compatibility/2006" xmlns:aink="http://schemas.microsoft.com/office/drawing/2016/ink" xmlns:am3d="http://schemas.microsoft.com/office/drawing/2017/model3d" xmlns:o="urn:schemas-microsoft-com:office:office" xmlns:oel="http://schemas.microsoft.com/office/2019/extlst" xmlns:r="http://schemas.openxmlformats.org/officeDocument/2006/relationships" xmlns:m="http://schemas.openxmlformats.org/officeDocument/2006/math" xmlns:v="urn:schemas-microsoft-com:vml" xmlns:wp14="http://schemas.microsoft.com/office/word/2010/wordprocessingDrawing" xmlns:wp="http://schemas.openxmlformats.org/drawingml/2006/wordprocessingDrawing" xmlns:w10="urn:schemas-microsoft-com:office:word" xmlns:w="http://schemas.openxmlformats.org/wordprocessingml/2006/main" xmlns:w14="http://schemas.microsoft.com/office/word/2010/wordml" xmlns:w15="http://schemas.microsoft.com/office/word/2012/wordml" xmlns:w16cex="http://schemas.microsoft.com/office/word/2018/wordml/cex" xmlns:w16cid="http://schemas.microsoft.com/office/word/2016/wordml/cid" xmlns:w16="http://schemas.microsoft.com/office/word/2018/wordml" xmlns:w16du="http://schemas.microsoft.com/office/word/2023/wordml/word16du" xmlns:w16sdtdh="http://schemas.microsoft.com/office/word/2020/wordml/sdtdatahash" xmlns:w16sdtfl="http://schemas.microsoft.com/office/word/2024/wordml/sdtformatlock" xmlns:w16se="http://schemas.microsoft.com/office/word/2015/wordml/symex" xmlns:wpg="http://schemas.microsoft.com/office/word/2010/wordprocessingGroup" xmlns:wpi="http://schemas.microsoft.com/office/word/2010/wordprocessingInk" xmlns:wne="http://schemas.microsoft.com/office/word/2006/wordml" xmlns:wps="http://schemas.microsoft.com/office/word/2010/wordprocessingShape" mc:Ignorable="w14 w15 w16se w16cid w16 w16cex w16sdtdh w16sdtfl w16du wp14">
+<w:endnotes xmlns:wpc="http://schemas.microsoft.com/office/word/2010/wordprocessingCanvas" xmlns:cx="http://schemas.microsoft.com/office/drawing/2014/chartex" xmlns:cx1="http://schemas.microsoft.com/office/drawing/2015/9/8/chartex" xmlns:cx2="http://schemas.microsoft.com/office/drawing/2015/10/21/chartex" xmlns:cx3="http://schemas.microsoft.com/office/drawing/2016/5/9/chartex" xmlns:cx4="http://schemas.microsoft.com/office/drawing/2016/5/10/chartex" xmlns:cx5="http://schemas.microsoft.com/office/drawing/2016/5/11/chartex" xmlns:cx6="http://schemas.microsoft.com/office/drawing/2016/5/12/chartex" xmlns:cx7="http://schemas.microsoft.com/office/drawing/2016/5/13/chartex" xmlns:cx8="http://schemas.microsoft.com/office/drawing/2016/5/14/chartex" xmlns:mc="http://schemas.openxmlformats.org/markup-compatibility/2006" xmlns:aink="http://schemas.microsoft.com/office/drawing/2016/ink" xmlns:am3d="http://schemas.microsoft.com/office/drawing/2017/model3d" xmlns:o="urn:schemas-microsoft-com:office:office" xmlns:oel="http://schemas.microsoft.com/office/2019/extlst" xmlns:r="http://schemas.openxmlformats.org/officeDocument/2006/relationships" xmlns:m="http://schemas.openxmlformats.org/officeDocument/2006/math" xmlns:v="urn:schemas-microsoft-com:vml" xmlns:wp14="http://schemas.microsoft.com/office/word/2010/wordprocessingDrawing" xmlns:wp="http://schemas.openxmlformats.org/drawingml/2006/wordprocessingDrawing" xmlns:w10="urn:schemas-microsoft-com:office:word" xmlns:w="http://schemas.openxmlformats.org/wordprocessingml/2006/main" xmlns:w14="http://schemas.microsoft.com/office/word/2010/wordml" xmlns:w15="http://schemas.microsoft.com/office/word/2012/wordml" xmlns:w16cex="http://schemas.microsoft.com/office/word/2018/wordml/cex" xmlns:w16cid="http://schemas.microsoft.com/office/word/2016/wordml/cid" xmlns:w16="http://schemas.microsoft.com/office/word/2018/wordml" xmlns:w16du="http://schemas.microsoft.com/office/word/2023/wordml/word16du" xmlns:w16sdtdh="http://schemas.microsoft.com/office/word/2020/wordml/sdtdatahash" xmlns:w16se="http://schemas.microsoft.com/office/word/2015/wordml/symex" xmlns:wpg="http://schemas.microsoft.com/office/word/2010/wordprocessingGroup" xmlns:wpi="http://schemas.microsoft.com/office/word/2010/wordprocessingInk" xmlns:wne="http://schemas.microsoft.com/office/word/2006/wordml" xmlns:wps="http://schemas.microsoft.com/office/word/2010/wordprocessingShape" mc:Ignorable="w14 w15 w16se w16cid w16 w16cex w16sdtdh w16du wp14">
   <w:endnote w:type="separator" w:id="-1">
     <w:p>
       <w:r>
@@ -1454,7 +1231,7 @@
 </file>
 
 <file path=word/footer1.xml><?xml version="1.0" encoding="utf-8"?>
-<w:ftr xmlns:wpc="http://schemas.microsoft.com/office/word/2010/wordprocessingCanvas" xmlns:cx="http://schemas.microsoft.com/office/drawing/2014/chartex" xmlns:cx1="http://schemas.microsoft.com/office/drawing/2015/9/8/chartex" xmlns:cx2="http://schemas.microsoft.com/office/drawing/2015/10/21/chartex" xmlns:cx3="http://schemas.microsoft.com/office/drawing/2016/5/9/chartex" xmlns:cx4="http://schemas.microsoft.com/office/drawing/2016/5/10/chartex" xmlns:cx5="http://schemas.microsoft.com/office/drawing/2016/5/11/chartex" xmlns:cx6="http://schemas.microsoft.com/office/drawing/2016/5/12/chartex" xmlns:cx7="http://schemas.microsoft.com/office/drawing/2016/5/13/chartex" xmlns:cx8="http://schemas.microsoft.com/office/drawing/2016/5/14/chartex" xmlns:mc="http://schemas.openxmlformats.org/markup-compatibility/2006" xmlns:aink="http://schemas.microsoft.com/office/drawing/2016/ink" xmlns:am3d="http://schemas.microsoft.com/office/drawing/2017/model3d" xmlns:o="urn:schemas-microsoft-com:office:office" xmlns:oel="http://schemas.microsoft.com/office/2019/extlst" xmlns:r="http://schemas.openxmlformats.org/officeDocument/2006/relationships" xmlns:m="http://schemas.openxmlformats.org/officeDocument/2006/math" xmlns:v="urn:schemas-microsoft-com:vml" xmlns:wp14="http://schemas.microsoft.com/office/word/2010/wordprocessingDrawing" xmlns:wp="http://schemas.openxmlformats.org/drawingml/2006/wordprocessingDrawing" xmlns:w10="urn:schemas-microsoft-com:office:word" xmlns:w="http://schemas.openxmlformats.org/wordprocessingml/2006/main" xmlns:w14="http://schemas.microsoft.com/office/word/2010/wordml" xmlns:w15="http://schemas.microsoft.com/office/word/2012/wordml" xmlns:w16cex="http://schemas.microsoft.com/office/word/2018/wordml/cex" xmlns:w16cid="http://schemas.microsoft.com/office/word/2016/wordml/cid" xmlns:w16="http://schemas.microsoft.com/office/word/2018/wordml" xmlns:w16du="http://schemas.microsoft.com/office/word/2023/wordml/word16du" xmlns:w16sdtdh="http://schemas.microsoft.com/office/word/2020/wordml/sdtdatahash" xmlns:w16sdtfl="http://schemas.microsoft.com/office/word/2024/wordml/sdtformatlock" xmlns:w16se="http://schemas.microsoft.com/office/word/2015/wordml/symex" xmlns:wpg="http://schemas.microsoft.com/office/word/2010/wordprocessingGroup" xmlns:wpi="http://schemas.microsoft.com/office/word/2010/wordprocessingInk" xmlns:wne="http://schemas.microsoft.com/office/word/2006/wordml" xmlns:wps="http://schemas.microsoft.com/office/word/2010/wordprocessingShape" mc:Ignorable="w14 w15 w16se w16cid w16 w16cex w16sdtdh w16sdtfl w16du wp14">
+<w:ftr xmlns:wpc="http://schemas.microsoft.com/office/word/2010/wordprocessingCanvas" xmlns:cx="http://schemas.microsoft.com/office/drawing/2014/chartex" xmlns:cx1="http://schemas.microsoft.com/office/drawing/2015/9/8/chartex" xmlns:cx2="http://schemas.microsoft.com/office/drawing/2015/10/21/chartex" xmlns:cx3="http://schemas.microsoft.com/office/drawing/2016/5/9/chartex" xmlns:cx4="http://schemas.microsoft.com/office/drawing/2016/5/10/chartex" xmlns:cx5="http://schemas.microsoft.com/office/drawing/2016/5/11/chartex" xmlns:cx6="http://schemas.microsoft.com/office/drawing/2016/5/12/chartex" xmlns:cx7="http://schemas.microsoft.com/office/drawing/2016/5/13/chartex" xmlns:cx8="http://schemas.microsoft.com/office/drawing/2016/5/14/chartex" xmlns:mc="http://schemas.openxmlformats.org/markup-compatibility/2006" xmlns:aink="http://schemas.microsoft.com/office/drawing/2016/ink" xmlns:am3d="http://schemas.microsoft.com/office/drawing/2017/model3d" xmlns:o="urn:schemas-microsoft-com:office:office" xmlns:oel="http://schemas.microsoft.com/office/2019/extlst" xmlns:r="http://schemas.openxmlformats.org/officeDocument/2006/relationships" xmlns:m="http://schemas.openxmlformats.org/officeDocument/2006/math" xmlns:v="urn:schemas-microsoft-com:vml" xmlns:wp14="http://schemas.microsoft.com/office/word/2010/wordprocessingDrawing" xmlns:wp="http://schemas.openxmlformats.org/drawingml/2006/wordprocessingDrawing" xmlns:w10="urn:schemas-microsoft-com:office:word" xmlns:w="http://schemas.openxmlformats.org/wordprocessingml/2006/main" xmlns:w14="http://schemas.microsoft.com/office/word/2010/wordml" xmlns:w15="http://schemas.microsoft.com/office/word/2012/wordml" xmlns:w16cex="http://schemas.microsoft.com/office/word/2018/wordml/cex" xmlns:w16cid="http://schemas.microsoft.com/office/word/2016/wordml/cid" xmlns:w16="http://schemas.microsoft.com/office/word/2018/wordml" xmlns:w16du="http://schemas.microsoft.com/office/word/2023/wordml/word16du" xmlns:w16sdtdh="http://schemas.microsoft.com/office/word/2020/wordml/sdtdatahash" xmlns:w16se="http://schemas.microsoft.com/office/word/2015/wordml/symex" xmlns:wpg="http://schemas.microsoft.com/office/word/2010/wordprocessingGroup" xmlns:wpi="http://schemas.microsoft.com/office/word/2010/wordprocessingInk" xmlns:wne="http://schemas.microsoft.com/office/word/2006/wordml" xmlns:wps="http://schemas.microsoft.com/office/word/2010/wordprocessingShape" mc:Ignorable="w14 w15 w16se w16cid w16 w16cex w16sdtdh w16du wp14">
   <w:p>
     <w:pPr>
       <w:pStyle w:val="a3"/>
@@ -1583,7 +1360,7 @@
 </file>
 
 <file path=word/footnotes.xml><?xml version="1.0" encoding="utf-8"?>
-<w:footnotes xmlns:wpc="http://schemas.microsoft.com/office/word/2010/wordprocessingCanvas" xmlns:cx="http://schemas.microsoft.com/office/drawing/2014/chartex" xmlns:cx1="http://schemas.microsoft.com/office/drawing/2015/9/8/chartex" xmlns:cx2="http://schemas.microsoft.com/office/drawing/2015/10/21/chartex" xmlns:cx3="http://schemas.microsoft.com/office/drawing/2016/5/9/chartex" xmlns:cx4="http://schemas.microsoft.com/office/drawing/2016/5/10/chartex" xmlns:cx5="http://schemas.microsoft.com/office/drawing/2016/5/11/chartex" xmlns:cx6="http://schemas.microsoft.com/office/drawing/2016/5/12/chartex" xmlns:cx7="http://schemas.microsoft.com/office/drawing/2016/5/13/chartex" xmlns:cx8="http://schemas.microsoft.com/office/drawing/2016/5/14/chartex" xmlns:mc="http://schemas.openxmlformats.org/markup-compatibility/2006" xmlns:aink="http://schemas.microsoft.com/office/drawing/2016/ink" xmlns:am3d="http://schemas.microsoft.com/office/drawing/2017/model3d" xmlns:o="urn:schemas-microsoft-com:office:office" xmlns:oel="http://schemas.microsoft.com/office/2019/extlst" xmlns:r="http://schemas.openxmlformats.org/officeDocument/2006/relationships" xmlns:m="http://schemas.openxmlformats.org/officeDocument/2006/math" xmlns:v="urn:schemas-microsoft-com:vml" xmlns:wp14="http://schemas.microsoft.com/office/word/2010/wordprocessingDrawing" xmlns:wp="http://schemas.openxmlformats.org/drawingml/2006/wordprocessingDrawing" xmlns:w10="urn:schemas-microsoft-com:office:word" xmlns:w="http://schemas.openxmlformats.org/wordprocessingml/2006/main" xmlns:w14="http://schemas.microsoft.com/office/word/2010/wordml" xmlns:w15="http://schemas.microsoft.com/office/word/2012/wordml" xmlns:w16cex="http://schemas.microsoft.com/office/word/2018/wordml/cex" xmlns:w16cid="http://schemas.microsoft.com/office/word/2016/wordml/cid" xmlns:w16="http://schemas.microsoft.com/office/word/2018/wordml" xmlns:w16du="http://schemas.microsoft.com/office/word/2023/wordml/word16du" xmlns:w16sdtdh="http://schemas.microsoft.com/office/word/2020/wordml/sdtdatahash" xmlns:w16sdtfl="http://schemas.microsoft.com/office/word/2024/wordml/sdtformatlock" xmlns:w16se="http://schemas.microsoft.com/office/word/2015/wordml/symex" xmlns:wpg="http://schemas.microsoft.com/office/word/2010/wordprocessingGroup" xmlns:wpi="http://schemas.microsoft.com/office/word/2010/wordprocessingInk" xmlns:wne="http://schemas.microsoft.com/office/word/2006/wordml" xmlns:wps="http://schemas.microsoft.com/office/word/2010/wordprocessingShape" mc:Ignorable="w14 w15 w16se w16cid w16 w16cex w16sdtdh w16sdtfl w16du wp14">
+<w:footnotes xmlns:wpc="http://schemas.microsoft.com/office/word/2010/wordprocessingCanvas" xmlns:cx="http://schemas.microsoft.com/office/drawing/2014/chartex" xmlns:cx1="http://schemas.microsoft.com/office/drawing/2015/9/8/chartex" xmlns:cx2="http://schemas.microsoft.com/office/drawing/2015/10/21/chartex" xmlns:cx3="http://schemas.microsoft.com/office/drawing/2016/5/9/chartex" xmlns:cx4="http://schemas.microsoft.com/office/drawing/2016/5/10/chartex" xmlns:cx5="http://schemas.microsoft.com/office/drawing/2016/5/11/chartex" xmlns:cx6="http://schemas.microsoft.com/office/drawing/2016/5/12/chartex" xmlns:cx7="http://schemas.microsoft.com/office/drawing/2016/5/13/chartex" xmlns:cx8="http://schemas.microsoft.com/office/drawing/2016/5/14/chartex" xmlns:mc="http://schemas.openxmlformats.org/markup-compatibility/2006" xmlns:aink="http://schemas.microsoft.com/office/drawing/2016/ink" xmlns:am3d="http://schemas.microsoft.com/office/drawing/2017/model3d" xmlns:o="urn:schemas-microsoft-com:office:office" xmlns:oel="http://schemas.microsoft.com/office/2019/extlst" xmlns:r="http://schemas.openxmlformats.org/officeDocument/2006/relationships" xmlns:m="http://schemas.openxmlformats.org/officeDocument/2006/math" xmlns:v="urn:schemas-microsoft-com:vml" xmlns:wp14="http://schemas.microsoft.com/office/word/2010/wordprocessingDrawing" xmlns:wp="http://schemas.openxmlformats.org/drawingml/2006/wordprocessingDrawing" xmlns:w10="urn:schemas-microsoft-com:office:word" xmlns:w="http://schemas.openxmlformats.org/wordprocessingml/2006/main" xmlns:w14="http://schemas.microsoft.com/office/word/2010/wordml" xmlns:w15="http://schemas.microsoft.com/office/word/2012/wordml" xmlns:w16cex="http://schemas.microsoft.com/office/word/2018/wordml/cex" xmlns:w16cid="http://schemas.microsoft.com/office/word/2016/wordml/cid" xmlns:w16="http://schemas.microsoft.com/office/word/2018/wordml" xmlns:w16du="http://schemas.microsoft.com/office/word/2023/wordml/word16du" xmlns:w16sdtdh="http://schemas.microsoft.com/office/word/2020/wordml/sdtdatahash" xmlns:w16se="http://schemas.microsoft.com/office/word/2015/wordml/symex" xmlns:wpg="http://schemas.microsoft.com/office/word/2010/wordprocessingGroup" xmlns:wpi="http://schemas.microsoft.com/office/word/2010/wordprocessingInk" xmlns:wne="http://schemas.microsoft.com/office/word/2006/wordml" xmlns:wps="http://schemas.microsoft.com/office/word/2010/wordprocessingShape" mc:Ignorable="w14 w15 w16se w16cid w16 w16cex w16sdtdh w16du wp14">
   <w:footnote w:type="separator" w:id="-1">
     <w:p>
       <w:r>
@@ -1602,7 +1379,7 @@
 </file>
 
 <file path=word/numbering.xml><?xml version="1.0" encoding="utf-8"?>
-<w:numbering xmlns:wpc="http://schemas.microsoft.com/office/word/2010/wordprocessingCanvas" xmlns:cx="http://schemas.microsoft.com/office/drawing/2014/chartex" xmlns:cx1="http://schemas.microsoft.com/office/drawing/2015/9/8/chartex" xmlns:cx2="http://schemas.microsoft.com/office/drawing/2015/10/21/chartex" xmlns:cx3="http://schemas.microsoft.com/office/drawing/2016/5/9/chartex" xmlns:cx4="http://schemas.microsoft.com/office/drawing/2016/5/10/chartex" xmlns:cx5="http://schemas.microsoft.com/office/drawing/2016/5/11/chartex" xmlns:cx6="http://schemas.microsoft.com/office/drawing/2016/5/12/chartex" xmlns:cx7="http://schemas.microsoft.com/office/drawing/2016/5/13/chartex" xmlns:cx8="http://schemas.microsoft.com/office/drawing/2016/5/14/chartex" xmlns:mc="http://schemas.openxmlformats.org/markup-compatibility/2006" xmlns:aink="http://schemas.microsoft.com/office/drawing/2016/ink" xmlns:am3d="http://schemas.microsoft.com/office/drawing/2017/model3d" xmlns:o="urn:schemas-microsoft-com:office:office" xmlns:oel="http://schemas.microsoft.com/office/2019/extlst" xmlns:r="http://schemas.openxmlformats.org/officeDocument/2006/relationships" xmlns:m="http://schemas.openxmlformats.org/officeDocument/2006/math" xmlns:v="urn:schemas-microsoft-com:vml" xmlns:wp14="http://schemas.microsoft.com/office/word/2010/wordprocessingDrawing" xmlns:wp="http://schemas.openxmlformats.org/drawingml/2006/wordprocessingDrawing" xmlns:w10="urn:schemas-microsoft-com:office:word" xmlns:w="http://schemas.openxmlformats.org/wordprocessingml/2006/main" xmlns:w14="http://schemas.microsoft.com/office/word/2010/wordml" xmlns:w15="http://schemas.microsoft.com/office/word/2012/wordml" xmlns:w16cex="http://schemas.microsoft.com/office/word/2018/wordml/cex" xmlns:w16cid="http://schemas.microsoft.com/office/word/2016/wordml/cid" xmlns:w16="http://schemas.microsoft.com/office/word/2018/wordml" xmlns:w16du="http://schemas.microsoft.com/office/word/2023/wordml/word16du" xmlns:w16sdtdh="http://schemas.microsoft.com/office/word/2020/wordml/sdtdatahash" xmlns:w16sdtfl="http://schemas.microsoft.com/office/word/2024/wordml/sdtformatlock" xmlns:w16se="http://schemas.microsoft.com/office/word/2015/wordml/symex" xmlns:wpg="http://schemas.microsoft.com/office/word/2010/wordprocessingGroup" xmlns:wpi="http://schemas.microsoft.com/office/word/2010/wordprocessingInk" xmlns:wne="http://schemas.microsoft.com/office/word/2006/wordml" xmlns:wps="http://schemas.microsoft.com/office/word/2010/wordprocessingShape" mc:Ignorable="w14 w15 w16se w16cid w16 w16cex w16sdtdh w16sdtfl w16du wp14">
+<w:numbering xmlns:wpc="http://schemas.microsoft.com/office/word/2010/wordprocessingCanvas" xmlns:cx="http://schemas.microsoft.com/office/drawing/2014/chartex" xmlns:cx1="http://schemas.microsoft.com/office/drawing/2015/9/8/chartex" xmlns:cx2="http://schemas.microsoft.com/office/drawing/2015/10/21/chartex" xmlns:cx3="http://schemas.microsoft.com/office/drawing/2016/5/9/chartex" xmlns:cx4="http://schemas.microsoft.com/office/drawing/2016/5/10/chartex" xmlns:cx5="http://schemas.microsoft.com/office/drawing/2016/5/11/chartex" xmlns:cx6="http://schemas.microsoft.com/office/drawing/2016/5/12/chartex" xmlns:cx7="http://schemas.microsoft.com/office/drawing/2016/5/13/chartex" xmlns:cx8="http://schemas.microsoft.com/office/drawing/2016/5/14/chartex" xmlns:mc="http://schemas.openxmlformats.org/markup-compatibility/2006" xmlns:aink="http://schemas.microsoft.com/office/drawing/2016/ink" xmlns:am3d="http://schemas.microsoft.com/office/drawing/2017/model3d" xmlns:o="urn:schemas-microsoft-com:office:office" xmlns:oel="http://schemas.microsoft.com/office/2019/extlst" xmlns:r="http://schemas.openxmlformats.org/officeDocument/2006/relationships" xmlns:m="http://schemas.openxmlformats.org/officeDocument/2006/math" xmlns:v="urn:schemas-microsoft-com:vml" xmlns:wp14="http://schemas.microsoft.com/office/word/2010/wordprocessingDrawing" xmlns:wp="http://schemas.openxmlformats.org/drawingml/2006/wordprocessingDrawing" xmlns:w10="urn:schemas-microsoft-com:office:word" xmlns:w="http://schemas.openxmlformats.org/wordprocessingml/2006/main" xmlns:w14="http://schemas.microsoft.com/office/word/2010/wordml" xmlns:w15="http://schemas.microsoft.com/office/word/2012/wordml" xmlns:w16cex="http://schemas.microsoft.com/office/word/2018/wordml/cex" xmlns:w16cid="http://schemas.microsoft.com/office/word/2016/wordml/cid" xmlns:w16="http://schemas.microsoft.com/office/word/2018/wordml" xmlns:w16du="http://schemas.microsoft.com/office/word/2023/wordml/word16du" xmlns:w16sdtdh="http://schemas.microsoft.com/office/word/2020/wordml/sdtdatahash" xmlns:w16se="http://schemas.microsoft.com/office/word/2015/wordml/symex" xmlns:wpg="http://schemas.microsoft.com/office/word/2010/wordprocessingGroup" xmlns:wpi="http://schemas.microsoft.com/office/word/2010/wordprocessingInk" xmlns:wne="http://schemas.microsoft.com/office/word/2006/wordml" xmlns:wps="http://schemas.microsoft.com/office/word/2010/wordprocessingShape" mc:Ignorable="w14 w15 w16se w16cid w16 w16cex w16sdtdh w16du wp14">
   <w:abstractNum w:abstractNumId="0" w15:restartNumberingAfterBreak="0">
     <w:nsid w:val="0905263C"/>
     <w:multiLevelType w:val="multilevel"/>
@@ -2919,155 +2696,6 @@
     </w:lvl>
   </w:abstractNum>
   <w:abstractNum w:abstractNumId="11" w15:restartNumberingAfterBreak="0">
-    <w:nsid w:val="72D353AB"/>
-    <w:multiLevelType w:val="multilevel"/>
-    <w:tmpl w:val="0BC03EBE"/>
-    <w:lvl w:ilvl="0">
-      <w:start w:val="1"/>
-      <w:numFmt w:val="bullet"/>
-      <w:lvlText w:val=""/>
-      <w:lvlJc w:val="left"/>
-      <w:pPr>
-        <w:tabs>
-          <w:tab w:val="num" w:pos="720"/>
-        </w:tabs>
-        <w:ind w:left="720" w:hanging="360"/>
-      </w:pPr>
-      <w:rPr>
-        <w:rFonts w:ascii="Wingdings" w:hAnsi="Wingdings" w:hint="default"/>
-        <w:sz w:val="20"/>
-      </w:rPr>
-    </w:lvl>
-    <w:lvl w:ilvl="1" w:tentative="1">
-      <w:start w:val="1"/>
-      <w:numFmt w:val="bullet"/>
-      <w:lvlText w:val=""/>
-      <w:lvlJc w:val="left"/>
-      <w:pPr>
-        <w:tabs>
-          <w:tab w:val="num" w:pos="1440"/>
-        </w:tabs>
-        <w:ind w:left="1440" w:hanging="360"/>
-      </w:pPr>
-      <w:rPr>
-        <w:rFonts w:ascii="Wingdings" w:hAnsi="Wingdings" w:hint="default"/>
-        <w:sz w:val="20"/>
-      </w:rPr>
-    </w:lvl>
-    <w:lvl w:ilvl="2" w:tentative="1">
-      <w:start w:val="1"/>
-      <w:numFmt w:val="bullet"/>
-      <w:lvlText w:val=""/>
-      <w:lvlJc w:val="left"/>
-      <w:pPr>
-        <w:tabs>
-          <w:tab w:val="num" w:pos="2160"/>
-        </w:tabs>
-        <w:ind w:left="2160" w:hanging="360"/>
-      </w:pPr>
-      <w:rPr>
-        <w:rFonts w:ascii="Wingdings" w:hAnsi="Wingdings" w:hint="default"/>
-        <w:sz w:val="20"/>
-      </w:rPr>
-    </w:lvl>
-    <w:lvl w:ilvl="3" w:tentative="1">
-      <w:start w:val="1"/>
-      <w:numFmt w:val="bullet"/>
-      <w:lvlText w:val=""/>
-      <w:lvlJc w:val="left"/>
-      <w:pPr>
-        <w:tabs>
-          <w:tab w:val="num" w:pos="2880"/>
-        </w:tabs>
-        <w:ind w:left="2880" w:hanging="360"/>
-      </w:pPr>
-      <w:rPr>
-        <w:rFonts w:ascii="Wingdings" w:hAnsi="Wingdings" w:hint="default"/>
-        <w:sz w:val="20"/>
-      </w:rPr>
-    </w:lvl>
-    <w:lvl w:ilvl="4" w:tentative="1">
-      <w:start w:val="1"/>
-      <w:numFmt w:val="bullet"/>
-      <w:lvlText w:val=""/>
-      <w:lvlJc w:val="left"/>
-      <w:pPr>
-        <w:tabs>
-          <w:tab w:val="num" w:pos="3600"/>
-        </w:tabs>
-        <w:ind w:left="3600" w:hanging="360"/>
-      </w:pPr>
-      <w:rPr>
-        <w:rFonts w:ascii="Wingdings" w:hAnsi="Wingdings" w:hint="default"/>
-        <w:sz w:val="20"/>
-      </w:rPr>
-    </w:lvl>
-    <w:lvl w:ilvl="5" w:tentative="1">
-      <w:start w:val="1"/>
-      <w:numFmt w:val="bullet"/>
-      <w:lvlText w:val=""/>
-      <w:lvlJc w:val="left"/>
-      <w:pPr>
-        <w:tabs>
-          <w:tab w:val="num" w:pos="4320"/>
-        </w:tabs>
-        <w:ind w:left="4320" w:hanging="360"/>
-      </w:pPr>
-      <w:rPr>
-        <w:rFonts w:ascii="Wingdings" w:hAnsi="Wingdings" w:hint="default"/>
-        <w:sz w:val="20"/>
-      </w:rPr>
-    </w:lvl>
-    <w:lvl w:ilvl="6" w:tentative="1">
-      <w:start w:val="1"/>
-      <w:numFmt w:val="bullet"/>
-      <w:lvlText w:val=""/>
-      <w:lvlJc w:val="left"/>
-      <w:pPr>
-        <w:tabs>
-          <w:tab w:val="num" w:pos="5040"/>
-        </w:tabs>
-        <w:ind w:left="5040" w:hanging="360"/>
-      </w:pPr>
-      <w:rPr>
-        <w:rFonts w:ascii="Wingdings" w:hAnsi="Wingdings" w:hint="default"/>
-        <w:sz w:val="20"/>
-      </w:rPr>
-    </w:lvl>
-    <w:lvl w:ilvl="7" w:tentative="1">
-      <w:start w:val="1"/>
-      <w:numFmt w:val="bullet"/>
-      <w:lvlText w:val=""/>
-      <w:lvlJc w:val="left"/>
-      <w:pPr>
-        <w:tabs>
-          <w:tab w:val="num" w:pos="5760"/>
-        </w:tabs>
-        <w:ind w:left="5760" w:hanging="360"/>
-      </w:pPr>
-      <w:rPr>
-        <w:rFonts w:ascii="Wingdings" w:hAnsi="Wingdings" w:hint="default"/>
-        <w:sz w:val="20"/>
-      </w:rPr>
-    </w:lvl>
-    <w:lvl w:ilvl="8" w:tentative="1">
-      <w:start w:val="1"/>
-      <w:numFmt w:val="bullet"/>
-      <w:lvlText w:val=""/>
-      <w:lvlJc w:val="left"/>
-      <w:pPr>
-        <w:tabs>
-          <w:tab w:val="num" w:pos="6480"/>
-        </w:tabs>
-        <w:ind w:left="6480" w:hanging="360"/>
-      </w:pPr>
-      <w:rPr>
-        <w:rFonts w:ascii="Wingdings" w:hAnsi="Wingdings" w:hint="default"/>
-        <w:sz w:val="20"/>
-      </w:rPr>
-    </w:lvl>
-  </w:abstractNum>
-  <w:abstractNum w:abstractNumId="12" w15:restartNumberingAfterBreak="0">
     <w:nsid w:val="78CC0F42"/>
     <w:multiLevelType w:val="hybridMultilevel"/>
     <w:tmpl w:val="FF0E469E"/>
@@ -3180,7 +2808,7 @@
       </w:rPr>
     </w:lvl>
   </w:abstractNum>
-  <w:abstractNum w:abstractNumId="13" w15:restartNumberingAfterBreak="0">
+  <w:abstractNum w:abstractNumId="12" w15:restartNumberingAfterBreak="0">
     <w:nsid w:val="7FDB4FBB"/>
     <w:multiLevelType w:val="hybridMultilevel"/>
     <w:tmpl w:val="02888A14"/>
@@ -3297,7 +2925,7 @@
     <w:abstractNumId w:val="7"/>
   </w:num>
   <w:num w:numId="2" w16cid:durableId="2072803160">
-    <w:abstractNumId w:val="13"/>
+    <w:abstractNumId w:val="12"/>
   </w:num>
   <w:num w:numId="3" w16cid:durableId="2080209827">
     <w:abstractNumId w:val="3"/>
@@ -3312,7 +2940,7 @@
     <w:abstractNumId w:val="1"/>
   </w:num>
   <w:num w:numId="7" w16cid:durableId="1047680920">
-    <w:abstractNumId w:val="12"/>
+    <w:abstractNumId w:val="11"/>
   </w:num>
   <w:num w:numId="8" w16cid:durableId="2128356627">
     <w:abstractNumId w:val="2"/>
@@ -3426,14 +3054,11 @@
       </w:lvl>
     </w:lvlOverride>
   </w:num>
-  <w:num w:numId="17" w16cid:durableId="1081682038">
-    <w:abstractNumId w:val="11"/>
-  </w:num>
 </w:numbering>
 </file>
 
 <file path=word/styles.xml><?xml version="1.0" encoding="utf-8"?>
-<w:styles xmlns:mc="http://schemas.openxmlformats.org/markup-compatibility/2006" xmlns:r="http://schemas.openxmlformats.org/officeDocument/2006/relationships" xmlns:w="http://schemas.openxmlformats.org/wordprocessingml/2006/main" xmlns:w14="http://schemas.microsoft.com/office/word/2010/wordml" xmlns:w15="http://schemas.microsoft.com/office/word/2012/wordml" xmlns:w16cex="http://schemas.microsoft.com/office/word/2018/wordml/cex" xmlns:w16cid="http://schemas.microsoft.com/office/word/2016/wordml/cid" xmlns:w16="http://schemas.microsoft.com/office/word/2018/wordml" xmlns:w16du="http://schemas.microsoft.com/office/word/2023/wordml/word16du" xmlns:w16sdtdh="http://schemas.microsoft.com/office/word/2020/wordml/sdtdatahash" xmlns:w16sdtfl="http://schemas.microsoft.com/office/word/2024/wordml/sdtformatlock" xmlns:w16se="http://schemas.microsoft.com/office/word/2015/wordml/symex" mc:Ignorable="w14 w15 w16se w16cid w16 w16cex w16sdtdh w16sdtfl w16du">
+<w:styles xmlns:mc="http://schemas.openxmlformats.org/markup-compatibility/2006" xmlns:r="http://schemas.openxmlformats.org/officeDocument/2006/relationships" xmlns:w="http://schemas.openxmlformats.org/wordprocessingml/2006/main" xmlns:w14="http://schemas.microsoft.com/office/word/2010/wordml" xmlns:w15="http://schemas.microsoft.com/office/word/2012/wordml" xmlns:w16cex="http://schemas.microsoft.com/office/word/2018/wordml/cex" xmlns:w16cid="http://schemas.microsoft.com/office/word/2016/wordml/cid" xmlns:w16="http://schemas.microsoft.com/office/word/2018/wordml" xmlns:w16du="http://schemas.microsoft.com/office/word/2023/wordml/word16du" xmlns:w16sdtdh="http://schemas.microsoft.com/office/word/2020/wordml/sdtdatahash" xmlns:w16se="http://schemas.microsoft.com/office/word/2015/wordml/symex" mc:Ignorable="w14 w15 w16se w16cid w16 w16cex w16sdtdh w16du">
   <w:docDefaults>
     <w:rPrDefault>
       <w:rPr>
@@ -3846,7 +3471,6 @@
   <w:style w:type="character" w:default="1" w:styleId="a0">
     <w:name w:val="Default Paragraph Font"/>
     <w:uiPriority w:val="1"/>
-    <w:semiHidden/>
     <w:unhideWhenUsed/>
   </w:style>
   <w:style w:type="table" w:default="1" w:styleId="a1">
@@ -3979,24 +3603,6 @@
       <w:color w:val="605E5C"/>
       <w:shd w:val="clear" w:color="auto" w:fill="E1DFDD"/>
     </w:rPr>
-  </w:style>
-  <w:style w:type="paragraph" w:customStyle="1" w:styleId="zfr3q">
-    <w:name w:val="zfr3q"/>
-    <w:basedOn w:val="a"/>
-    <w:rsid w:val="000E43D3"/>
-    <w:pPr>
-      <w:spacing w:before="100" w:beforeAutospacing="1" w:after="100" w:afterAutospacing="1"/>
-    </w:pPr>
-    <w:rPr>
-      <w:rFonts w:ascii="굴림" w:eastAsia="굴림" w:hAnsi="굴림" w:cs="굴림"/>
-      <w:sz w:val="24"/>
-      <w:lang w:eastAsia="ko-KR"/>
-    </w:rPr>
-  </w:style>
-  <w:style w:type="character" w:customStyle="1" w:styleId="c9dxtc">
-    <w:name w:val="c9dxtc"/>
-    <w:basedOn w:val="a0"/>
-    <w:rsid w:val="000E43D3"/>
   </w:style>
 </w:styles>
 </file>
@@ -4297,6 +3903,21 @@
 </file>
 
 <file path=customXml/item1.xml><?xml version="1.0" encoding="utf-8"?>
+<?mso-contentType ?>
+<FormTemplates xmlns="http://schemas.microsoft.com/sharepoint/v3/contenttype/forms">
+  <Display>DocumentLibraryForm</Display>
+  <Edit>DocumentLibraryForm</Edit>
+  <New>DocumentLibraryForm</New>
+</FormTemplates>
+</file>
+
+<file path=customXml/item2.xml><?xml version="1.0" encoding="utf-8"?>
+<p:properties xmlns:p="http://schemas.microsoft.com/office/2006/metadata/properties" xmlns:xsi="http://www.w3.org/2001/XMLSchema-instance" xmlns:pc="http://schemas.microsoft.com/office/infopath/2007/PartnerControls">
+  <documentManagement/>
+</p:properties>
+</file>
+
+<file path=customXml/item3.xml><?xml version="1.0" encoding="utf-8"?>
 <ct:contentTypeSchema xmlns:ct="http://schemas.microsoft.com/office/2006/metadata/contentType" xmlns:ma="http://schemas.microsoft.com/office/2006/metadata/properties/metaAttributes" ct:_="" ma:_="" ma:contentTypeName="문서" ma:contentTypeID="0x010100D128DA6EB5643C4F91A121ED41B44BEF" ma:contentTypeVersion="14" ma:contentTypeDescription="새 문서를 만듭니다." ma:contentTypeScope="" ma:versionID="bb489b0cca811b68c86e4a06fea89659">
   <xsd:schema xmlns:xsd="http://www.w3.org/2001/XMLSchema" xmlns:xs="http://www.w3.org/2001/XMLSchema" xmlns:p="http://schemas.microsoft.com/office/2006/metadata/properties" xmlns:ns3="3dd47732-b563-4b05-a300-ef07f486d354" xmlns:ns4="7301a535-bcd7-4066-b995-8a0b32902a07" targetNamespace="http://schemas.microsoft.com/office/2006/metadata/properties" ma:root="true" ma:fieldsID="206eaff63d68e697f7e6f0f9b28f5940" ns3:_="" ns4:_="">
     <xsd:import namespace="3dd47732-b563-4b05-a300-ef07f486d354"/>
@@ -4525,22 +4146,24 @@
 </ct:contentTypeSchema>
 </file>
 
-<file path=customXml/item2.xml><?xml version="1.0" encoding="utf-8"?>
-<p:properties xmlns:p="http://schemas.microsoft.com/office/2006/metadata/properties" xmlns:xsi="http://www.w3.org/2001/XMLSchema-instance" xmlns:pc="http://schemas.microsoft.com/office/infopath/2007/PartnerControls">
-  <documentManagement/>
-</p:properties>
+<file path=customXml/itemProps1.xml><?xml version="1.0" encoding="utf-8"?>
+<ds:datastoreItem xmlns:ds="http://schemas.openxmlformats.org/officeDocument/2006/customXml" ds:itemID="{0BFC17D1-98B8-4127-8ABC-1B4CCB780934}">
+  <ds:schemaRefs>
+    <ds:schemaRef ds:uri="http://schemas.microsoft.com/sharepoint/v3/contenttype/forms"/>
+  </ds:schemaRefs>
+</ds:datastoreItem>
 </file>
 
-<file path=customXml/item3.xml><?xml version="1.0" encoding="utf-8"?>
-<?mso-contentType ?>
-<FormTemplates xmlns="http://schemas.microsoft.com/sharepoint/v3/contenttype/forms">
-  <Display>DocumentLibraryForm</Display>
-  <Edit>DocumentLibraryForm</Edit>
-  <New>DocumentLibraryForm</New>
-</FormTemplates>
+<file path=customXml/itemProps2.xml><?xml version="1.0" encoding="utf-8"?>
+<ds:datastoreItem xmlns:ds="http://schemas.openxmlformats.org/officeDocument/2006/customXml" ds:itemID="{E0028DE5-6926-4660-ABE5-C387B04C93FC}">
+  <ds:schemaRefs>
+    <ds:schemaRef ds:uri="http://schemas.microsoft.com/office/2006/metadata/properties"/>
+    <ds:schemaRef ds:uri="http://schemas.microsoft.com/office/infopath/2007/PartnerControls"/>
+  </ds:schemaRefs>
+</ds:datastoreItem>
 </file>
 
-<file path=customXml/itemProps1.xml><?xml version="1.0" encoding="utf-8"?>
+<file path=customXml/itemProps3.xml><?xml version="1.0" encoding="utf-8"?>
 <ds:datastoreItem xmlns:ds="http://schemas.openxmlformats.org/officeDocument/2006/customXml" ds:itemID="{090B1DD4-636E-4477-AA17-EF9859E7900B}">
   <ds:schemaRefs>
     <ds:schemaRef ds:uri="http://schemas.microsoft.com/office/2006/metadata/contentType"/>
@@ -4557,21 +4180,4 @@
     <ds:schemaRef ds:uri="http://schemas.microsoft.com/internal/obd"/>
   </ds:schemaRefs>
 </ds:datastoreItem>
-</file>
-
-<file path=customXml/itemProps2.xml><?xml version="1.0" encoding="utf-8"?>
-<ds:datastoreItem xmlns:ds="http://schemas.openxmlformats.org/officeDocument/2006/customXml" ds:itemID="{E0028DE5-6926-4660-ABE5-C387B04C93FC}">
-  <ds:schemaRefs>
-    <ds:schemaRef ds:uri="http://schemas.microsoft.com/office/2006/metadata/properties"/>
-    <ds:schemaRef ds:uri="http://schemas.microsoft.com/office/infopath/2007/PartnerControls"/>
-  </ds:schemaRefs>
-</ds:datastoreItem>
-</file>
-
-<file path=customXml/itemProps3.xml><?xml version="1.0" encoding="utf-8"?>
-<ds:datastoreItem xmlns:ds="http://schemas.openxmlformats.org/officeDocument/2006/customXml" ds:itemID="{0BFC17D1-98B8-4127-8ABC-1B4CCB780934}">
-  <ds:schemaRefs>
-    <ds:schemaRef ds:uri="http://schemas.microsoft.com/sharepoint/v3/contenttype/forms"/>
-  </ds:schemaRefs>
-</ds:datastoreItem>
 </file>
</xml_diff>

<commit_message>
Simplify research interests to keyword tags, remove teaching interests, update CV
Co-Authored-By: Claude Sonnet 4.6 <noreply@anthropic.com>
</commit_message>
<xml_diff>
--- a/public/cv.docx
+++ b/public/cv.docx
@@ -170,39 +170,17 @@
         </w:numPr>
         <w:rPr>
           <w:rFonts w:ascii="Times New Roman" w:hAnsi="Times New Roman"/>
-          <w:b/>
-          <w:bCs/>
-        </w:rPr>
-      </w:pPr>
-      <w:r>
-        <w:rPr>
-          <w:rFonts w:ascii="Times New Roman" w:hAnsi="Times New Roman"/>
-          <w:b/>
-          <w:bCs/>
-        </w:rPr>
-        <w:t>Feb. 2025 | Ph.D. in Political Science, Yonsei University, South Korea </w:t>
-      </w:r>
-      <w:r>
-        <w:rPr>
-          <w:rFonts w:ascii="Times New Roman" w:hAnsi="Times New Roman"/>
-          <w:b/>
-          <w:bCs/>
-        </w:rPr>
-        <w:t>(</w:t>
-      </w:r>
-      <w:r>
-        <w:rPr>
-          <w:rFonts w:ascii="Times New Roman" w:hAnsi="Times New Roman"/>
-          <w:b/>
-          <w:bCs/>
-        </w:rPr>
-        <w:t>Doctoral Dissertation:</w:t>
-      </w:r>
-      <w:r>
-        <w:rPr>
-          <w:rFonts w:ascii="Times New Roman" w:hAnsi="Times New Roman"/>
-          <w:b/>
-          <w:bCs/>
+        </w:rPr>
+      </w:pPr>
+      <w:r>
+        <w:rPr>
+          <w:rFonts w:ascii="Times New Roman" w:hAnsi="Times New Roman"/>
+        </w:rPr>
+        <w:t>Feb. 2025 | Ph.D. in Political Science, Yonsei University, South Korea (Doctoral Dissertation:</w:t>
+      </w:r>
+      <w:r>
+        <w:rPr>
+          <w:rFonts w:ascii="Times New Roman" w:hAnsi="Times New Roman"/>
           <w:i/>
           <w:iCs/>
         </w:rPr>
@@ -211,8 +189,6 @@
       <w:r>
         <w:rPr>
           <w:rFonts w:ascii="Times New Roman" w:hAnsi="Times New Roman"/>
-          <w:b/>
-          <w:bCs/>
         </w:rPr>
         <w:t>)</w:t>
       </w:r>
@@ -225,47 +201,17 @@
         </w:numPr>
         <w:rPr>
           <w:rFonts w:ascii="Times New Roman" w:hAnsi="Times New Roman"/>
-          <w:b/>
-          <w:bCs/>
-        </w:rPr>
-      </w:pPr>
-      <w:r>
-        <w:rPr>
-          <w:rFonts w:ascii="Times New Roman" w:hAnsi="Times New Roman"/>
-          <w:b/>
-          <w:bCs/>
-        </w:rPr>
-        <w:t>Feb. 2019 | M.A. in Political Science, Yonsei University</w:t>
-      </w:r>
-      <w:r>
-        <w:rPr>
-          <w:rFonts w:ascii="Times New Roman" w:hAnsi="Times New Roman"/>
-          <w:b/>
-          <w:bCs/>
-        </w:rPr>
-        <w:t xml:space="preserve"> (</w:t>
-      </w:r>
-      <w:r>
-        <w:rPr>
-          <w:rFonts w:ascii="Times New Roman" w:hAnsi="Times New Roman"/>
-          <w:b/>
-          <w:bCs/>
-        </w:rPr>
-        <w:t>master’s</w:t>
-      </w:r>
-      <w:r>
-        <w:rPr>
-          <w:rFonts w:ascii="Times New Roman" w:hAnsi="Times New Roman"/>
-          <w:b/>
-          <w:bCs/>
-        </w:rPr>
-        <w:t> Thesis: </w:t>
-      </w:r>
-      <w:r>
-        <w:rPr>
-          <w:rFonts w:ascii="Times New Roman" w:hAnsi="Times New Roman"/>
-          <w:b/>
-          <w:bCs/>
+        </w:rPr>
+      </w:pPr>
+      <w:r>
+        <w:rPr>
+          <w:rFonts w:ascii="Times New Roman" w:hAnsi="Times New Roman"/>
+        </w:rPr>
+        <w:t>Feb. 2019 | M.A. in Political Science, Yonsei University (master’s Thesis: </w:t>
+      </w:r>
+      <w:r>
+        <w:rPr>
+          <w:rFonts w:ascii="Times New Roman" w:hAnsi="Times New Roman"/>
           <w:i/>
           <w:iCs/>
         </w:rPr>
@@ -274,8 +220,6 @@
       <w:r>
         <w:rPr>
           <w:rFonts w:ascii="Times New Roman" w:hAnsi="Times New Roman"/>
-          <w:b/>
-          <w:bCs/>
         </w:rPr>
         <w:t>)</w:t>
       </w:r>
@@ -288,15 +232,11 @@
         </w:numPr>
         <w:rPr>
           <w:rFonts w:ascii="Times New Roman" w:hAnsi="Times New Roman"/>
-          <w:b/>
-          <w:bCs/>
-        </w:rPr>
-      </w:pPr>
-      <w:r>
-        <w:rPr>
-          <w:rFonts w:ascii="Times New Roman" w:hAnsi="Times New Roman"/>
-          <w:b/>
-          <w:bCs/>
+        </w:rPr>
+      </w:pPr>
+      <w:r>
+        <w:rPr>
+          <w:rFonts w:ascii="Times New Roman" w:hAnsi="Times New Roman"/>
         </w:rPr>
         <w:t>Feb. 2015 | B.A. in International Relations, Yonsei University </w:t>
       </w:r>
@@ -309,17 +249,423 @@
         </w:numPr>
         <w:rPr>
           <w:rFonts w:ascii="Times New Roman" w:hAnsi="Times New Roman"/>
+        </w:rPr>
+      </w:pPr>
+      <w:r>
+        <w:rPr>
+          <w:rFonts w:ascii="Times New Roman" w:hAnsi="Times New Roman"/>
+        </w:rPr>
+        <w:t>Dec. 2014 | Exchange Student, ISM University of Management and Economics, Lithuania (One-Year Program)</w:t>
+      </w:r>
+    </w:p>
+    <w:p>
+      <w:pPr>
+        <w:rPr>
+          <w:rFonts w:ascii="Times New Roman" w:hAnsi="Times New Roman"/>
           <w:b/>
           <w:bCs/>
         </w:rPr>
       </w:pPr>
-      <w:r>
+    </w:p>
+    <w:p>
+      <w:pPr>
         <w:rPr>
           <w:rFonts w:ascii="Times New Roman" w:hAnsi="Times New Roman"/>
           <w:b/>
           <w:bCs/>
-        </w:rPr>
-        <w:t>Dec. 2014 | Exchange Student, ISM University of Management and Economics, Lithuania (One-Year Program)</w:t>
+          <w:u w:val="single"/>
+          <w:lang w:eastAsia="ko-KR"/>
+        </w:rPr>
+      </w:pPr>
+      <w:r>
+        <w:rPr>
+          <w:rFonts w:ascii="Times New Roman" w:hAnsi="Times New Roman"/>
+          <w:b/>
+          <w:bCs/>
+          <w:u w:val="single"/>
+          <w:lang w:eastAsia="ko-KR"/>
+        </w:rPr>
+        <w:t>RESEARCH INTERESTS</w:t>
+      </w:r>
+    </w:p>
+    <w:p>
+      <w:pPr>
+        <w:rPr>
+          <w:rFonts w:ascii="Times New Roman" w:hAnsi="Times New Roman"/>
+          <w:b/>
+          <w:bCs/>
+          <w:lang w:eastAsia="ko-KR"/>
+        </w:rPr>
+      </w:pPr>
+      <w:r>
+        <w:rPr>
+          <w:rFonts w:ascii="Times New Roman" w:hAnsi="Times New Roman"/>
+          <w:b/>
+          <w:bCs/>
+          <w:lang w:eastAsia="ko-KR"/>
+        </w:rPr>
+        <w:t>Comparative Politics</w:t>
+      </w:r>
+    </w:p>
+    <w:p>
+      <w:pPr>
+        <w:numPr>
+          <w:ilvl w:val="0"/>
+          <w:numId w:val="32"/>
+        </w:numPr>
+        <w:rPr>
+          <w:rFonts w:ascii="Times New Roman" w:hAnsi="Times New Roman"/>
+        </w:rPr>
+      </w:pPr>
+      <w:r>
+        <w:rPr>
+          <w:rFonts w:ascii="Times New Roman" w:hAnsi="Times New Roman"/>
+        </w:rPr>
+        <w:t>Politics of death, state funerals, and national cemeteries</w:t>
+      </w:r>
+      <w:r>
+        <w:rPr>
+          <w:rFonts w:ascii="Times New Roman" w:hAnsi="Times New Roman"/>
+        </w:rPr>
+        <w:t xml:space="preserve">, </w:t>
+      </w:r>
+      <w:r>
+        <w:rPr>
+          <w:rFonts w:ascii="Times New Roman" w:hAnsi="Times New Roman"/>
+        </w:rPr>
+        <w:t>State-society relations and contentious politics</w:t>
+      </w:r>
+      <w:r>
+        <w:rPr>
+          <w:rFonts w:ascii="Times New Roman" w:hAnsi="Times New Roman"/>
+        </w:rPr>
+        <w:t xml:space="preserve">, </w:t>
+      </w:r>
+      <w:r>
+        <w:rPr>
+          <w:rFonts w:ascii="Times New Roman" w:hAnsi="Times New Roman"/>
+        </w:rPr>
+        <w:t>Nationalism, national identity, and collective memory</w:t>
+      </w:r>
+      <w:r>
+        <w:rPr>
+          <w:rFonts w:ascii="Times New Roman" w:hAnsi="Times New Roman"/>
+        </w:rPr>
+        <w:t xml:space="preserve">, </w:t>
+      </w:r>
+      <w:r>
+        <w:rPr>
+          <w:rFonts w:ascii="Times New Roman" w:hAnsi="Times New Roman"/>
+        </w:rPr>
+        <w:t>Gendered politics and structured agency</w:t>
+      </w:r>
+      <w:r>
+        <w:rPr>
+          <w:rFonts w:ascii="Times New Roman" w:hAnsi="Times New Roman"/>
+        </w:rPr>
+        <w:t xml:space="preserve">, </w:t>
+      </w:r>
+      <w:r>
+        <w:rPr>
+          <w:rFonts w:ascii="Times New Roman" w:hAnsi="Times New Roman"/>
+        </w:rPr>
+        <w:t>Migration</w:t>
+      </w:r>
+      <w:r>
+        <w:rPr>
+          <w:rFonts w:ascii="Times New Roman" w:hAnsi="Times New Roman"/>
+        </w:rPr>
+        <w:t xml:space="preserve"> and </w:t>
+      </w:r>
+      <w:r>
+        <w:rPr>
+          <w:rFonts w:ascii="Times New Roman" w:hAnsi="Times New Roman"/>
+        </w:rPr>
+        <w:t>citizenship</w:t>
+      </w:r>
+    </w:p>
+    <w:p>
+      <w:pPr>
+        <w:rPr>
+          <w:rFonts w:ascii="Times New Roman" w:hAnsi="Times New Roman"/>
+          <w:b/>
+          <w:bCs/>
+          <w:lang w:eastAsia="ko-KR"/>
+        </w:rPr>
+      </w:pPr>
+      <w:r>
+        <w:rPr>
+          <w:rFonts w:ascii="Times New Roman" w:hAnsi="Times New Roman"/>
+          <w:b/>
+          <w:bCs/>
+          <w:lang w:eastAsia="ko-KR"/>
+        </w:rPr>
+        <w:t>International Relations</w:t>
+      </w:r>
+    </w:p>
+    <w:p>
+      <w:pPr>
+        <w:numPr>
+          <w:ilvl w:val="0"/>
+          <w:numId w:val="33"/>
+        </w:numPr>
+        <w:rPr>
+          <w:rFonts w:ascii="Times New Roman" w:hAnsi="Times New Roman"/>
+        </w:rPr>
+      </w:pPr>
+      <w:r>
+        <w:rPr>
+          <w:rFonts w:ascii="Times New Roman" w:hAnsi="Times New Roman"/>
+        </w:rPr>
+        <w:t>Memory politics and international security</w:t>
+      </w:r>
+      <w:r>
+        <w:rPr>
+          <w:rFonts w:ascii="Times New Roman" w:hAnsi="Times New Roman"/>
+        </w:rPr>
+        <w:t xml:space="preserve">, </w:t>
+      </w:r>
+      <w:r>
+        <w:rPr>
+          <w:rFonts w:ascii="Times New Roman" w:hAnsi="Times New Roman"/>
+        </w:rPr>
+        <w:t>Critical IR theories</w:t>
+      </w:r>
+      <w:r>
+        <w:rPr>
+          <w:rFonts w:ascii="Times New Roman" w:hAnsi="Times New Roman"/>
+        </w:rPr>
+        <w:t xml:space="preserve">, </w:t>
+      </w:r>
+      <w:r>
+        <w:rPr>
+          <w:rFonts w:ascii="Times New Roman" w:hAnsi="Times New Roman"/>
+        </w:rPr>
+        <w:t>Inter-Korean relations and borderland studies</w:t>
+      </w:r>
+      <w:r>
+        <w:rPr>
+          <w:rFonts w:ascii="Times New Roman" w:hAnsi="Times New Roman"/>
+        </w:rPr>
+        <w:t xml:space="preserve">, </w:t>
+      </w:r>
+      <w:proofErr w:type="gramStart"/>
+      <w:r>
+        <w:rPr>
+          <w:rFonts w:ascii="Times New Roman" w:hAnsi="Times New Roman"/>
+        </w:rPr>
+        <w:t>Post-colonial</w:t>
+      </w:r>
+      <w:proofErr w:type="gramEnd"/>
+      <w:r>
+        <w:rPr>
+          <w:rFonts w:ascii="Times New Roman" w:hAnsi="Times New Roman"/>
+        </w:rPr>
+        <w:t xml:space="preserve"> politics in East Asia</w:t>
+      </w:r>
+    </w:p>
+    <w:p>
+      <w:pPr>
+        <w:rPr>
+          <w:rFonts w:ascii="Times New Roman" w:hAnsi="Times New Roman"/>
+          <w:b/>
+          <w:bCs/>
+          <w:lang w:eastAsia="ko-KR"/>
+        </w:rPr>
+      </w:pPr>
+      <w:r>
+        <w:rPr>
+          <w:rFonts w:ascii="Times New Roman" w:hAnsi="Times New Roman"/>
+          <w:b/>
+          <w:bCs/>
+          <w:lang w:eastAsia="ko-KR"/>
+        </w:rPr>
+        <w:t>Korean Studies</w:t>
+      </w:r>
+    </w:p>
+    <w:p>
+      <w:pPr>
+        <w:numPr>
+          <w:ilvl w:val="0"/>
+          <w:numId w:val="34"/>
+        </w:numPr>
+        <w:rPr>
+          <w:rFonts w:ascii="Times New Roman" w:hAnsi="Times New Roman"/>
+        </w:rPr>
+      </w:pPr>
+      <w:r>
+        <w:rPr>
+          <w:rFonts w:ascii="Times New Roman" w:hAnsi="Times New Roman"/>
+        </w:rPr>
+        <w:t>South Korean state formation</w:t>
+      </w:r>
+      <w:r>
+        <w:rPr>
+          <w:rFonts w:ascii="Times New Roman" w:hAnsi="Times New Roman"/>
+        </w:rPr>
+        <w:t xml:space="preserve">, </w:t>
+      </w:r>
+      <w:r>
+        <w:rPr>
+          <w:rFonts w:ascii="Times New Roman" w:hAnsi="Times New Roman"/>
+        </w:rPr>
+        <w:t>Korean national identity and belonging</w:t>
+      </w:r>
+      <w:r>
+        <w:rPr>
+          <w:rFonts w:ascii="Times New Roman" w:hAnsi="Times New Roman"/>
+        </w:rPr>
+        <w:t xml:space="preserve">, </w:t>
+      </w:r>
+      <w:r>
+        <w:rPr>
+          <w:rFonts w:ascii="Times New Roman" w:hAnsi="Times New Roman"/>
+        </w:rPr>
+        <w:t>Korean War</w:t>
+      </w:r>
+      <w:r>
+        <w:rPr>
+          <w:rFonts w:ascii="Times New Roman" w:hAnsi="Times New Roman"/>
+        </w:rPr>
+        <w:t xml:space="preserve"> widows, </w:t>
+      </w:r>
+      <w:r>
+        <w:rPr>
+          <w:rFonts w:ascii="Times New Roman" w:hAnsi="Times New Roman"/>
+        </w:rPr>
+        <w:t>U</w:t>
+      </w:r>
+      <w:r>
+        <w:rPr>
+          <w:rFonts w:ascii="Times New Roman" w:hAnsi="Times New Roman"/>
+        </w:rPr>
+        <w:t>nification issues</w:t>
+      </w:r>
+    </w:p>
+    <w:p>
+      <w:pPr>
+        <w:rPr>
+          <w:rFonts w:ascii="Times New Roman" w:hAnsi="Times New Roman"/>
+          <w:b/>
+          <w:bCs/>
+        </w:rPr>
+      </w:pPr>
+    </w:p>
+    <w:p>
+      <w:pPr>
+        <w:rPr>
+          <w:rFonts w:ascii="Times New Roman" w:hAnsi="Times New Roman"/>
+          <w:b/>
+          <w:bCs/>
+          <w:u w:val="single"/>
+          <w:lang w:eastAsia="ko-KR"/>
+        </w:rPr>
+      </w:pPr>
+      <w:r>
+        <w:rPr>
+          <w:rFonts w:ascii="Times New Roman" w:hAnsi="Times New Roman"/>
+          <w:b/>
+          <w:bCs/>
+          <w:u w:val="single"/>
+          <w:lang w:eastAsia="ko-KR"/>
+        </w:rPr>
+        <w:t>TEACHING INTERESTS</w:t>
+      </w:r>
+    </w:p>
+    <w:p>
+      <w:pPr>
+        <w:rPr>
+          <w:rFonts w:ascii="Times New Roman" w:hAnsi="Times New Roman"/>
+          <w:b/>
+          <w:bCs/>
+          <w:lang w:eastAsia="ko-KR"/>
+        </w:rPr>
+      </w:pPr>
+      <w:r>
+        <w:rPr>
+          <w:rFonts w:ascii="Times New Roman" w:hAnsi="Times New Roman"/>
+          <w:b/>
+          <w:bCs/>
+          <w:lang w:eastAsia="ko-KR"/>
+        </w:rPr>
+        <w:t>Comparative Politics</w:t>
+      </w:r>
+    </w:p>
+    <w:p>
+      <w:pPr>
+        <w:numPr>
+          <w:ilvl w:val="0"/>
+          <w:numId w:val="32"/>
+        </w:numPr>
+        <w:rPr>
+          <w:rFonts w:ascii="Times New Roman" w:hAnsi="Times New Roman"/>
+        </w:rPr>
+      </w:pPr>
+      <w:r>
+        <w:rPr>
+          <w:rFonts w:ascii="Times New Roman" w:hAnsi="Times New Roman"/>
+        </w:rPr>
+        <w:t>Understanding of Contemporary Politics</w:t>
+      </w:r>
+      <w:r>
+        <w:rPr>
+          <w:rFonts w:ascii="Times New Roman" w:hAnsi="Times New Roman"/>
+        </w:rPr>
+        <w:t xml:space="preserve">, </w:t>
+      </w:r>
+      <w:r>
+        <w:rPr>
+          <w:rFonts w:ascii="Times New Roman" w:hAnsi="Times New Roman"/>
+        </w:rPr>
+        <w:t>Politics and Power in Films</w:t>
+      </w:r>
+    </w:p>
+    <w:p>
+      <w:pPr>
+        <w:rPr>
+          <w:rFonts w:ascii="Times New Roman" w:hAnsi="Times New Roman"/>
+          <w:b/>
+          <w:bCs/>
+          <w:lang w:eastAsia="ko-KR"/>
+        </w:rPr>
+      </w:pPr>
+      <w:r>
+        <w:rPr>
+          <w:rFonts w:ascii="Times New Roman" w:hAnsi="Times New Roman"/>
+          <w:b/>
+          <w:bCs/>
+          <w:lang w:eastAsia="ko-KR"/>
+        </w:rPr>
+        <w:t>Korean Studies</w:t>
+      </w:r>
+    </w:p>
+    <w:p>
+      <w:pPr>
+        <w:numPr>
+          <w:ilvl w:val="0"/>
+          <w:numId w:val="34"/>
+        </w:numPr>
+        <w:rPr>
+          <w:rFonts w:ascii="Times New Roman" w:hAnsi="Times New Roman"/>
+        </w:rPr>
+      </w:pPr>
+      <w:r>
+        <w:rPr>
+          <w:rFonts w:ascii="Times New Roman" w:hAnsi="Times New Roman"/>
+        </w:rPr>
+        <w:t>Division and Unification of Korea</w:t>
+      </w:r>
+      <w:r>
+        <w:rPr>
+          <w:rFonts w:ascii="Times New Roman" w:hAnsi="Times New Roman"/>
+        </w:rPr>
+        <w:t xml:space="preserve">, </w:t>
+      </w:r>
+      <w:r>
+        <w:rPr>
+          <w:rFonts w:ascii="Times New Roman" w:hAnsi="Times New Roman"/>
+        </w:rPr>
+        <w:t>On National Unification Education</w:t>
       </w:r>
     </w:p>
     <w:p>
@@ -650,7 +996,7 @@
         <w:rPr>
           <w:rFonts w:ascii="Times New Roman" w:hAnsi="Times New Roman"/>
         </w:rPr>
-        <w:t>"Memorizing Unmemorable Deaths in the Jeju 4.3 Uprising." Manuscript in preparation [in English]</w:t>
+        <w:t>"Memorizing Unmemorable Deaths in the Jeju 4.3 Uprising." Manuscript in preparation</w:t>
       </w:r>
     </w:p>
     <w:p>
@@ -882,6 +1228,7 @@
         <w:rPr>
           <w:rFonts w:ascii="Times New Roman" w:hAnsi="Times New Roman"/>
         </w:rPr>
+        <w:lastRenderedPageBreak/>
         <w:t>Fall 2025. Politics and Power in Films, Kangwon National University</w:t>
       </w:r>
     </w:p>
@@ -1115,7 +1462,6 @@
         <w:rPr>
           <w:rFonts w:ascii="Times New Roman" w:hAnsi="Times New Roman"/>
         </w:rPr>
-        <w:lastRenderedPageBreak/>
         <w:t>Jul. 2025 | Presenter, "Reframing Nationalist Manhood through Korean War Widows," </w:t>
       </w:r>
       <w:r>
@@ -1785,6 +2131,7 @@
         <w:rPr>
           <w:rFonts w:ascii="Times New Roman" w:hAnsi="Times New Roman"/>
         </w:rPr>
+        <w:lastRenderedPageBreak/>
         <w:t>2020 BK21 Plus Summer School, Social Science Research Methods</w:t>
       </w:r>
       <w:r>
@@ -1815,7 +2162,7 @@
           <w:numId w:val="31"/>
         </w:numPr>
         <w:rPr>
-          <w:rFonts w:ascii="Times New Roman" w:hAnsi="Times New Roman" w:hint="eastAsia"/>
+          <w:rFonts w:ascii="Times New Roman" w:hAnsi="Times New Roman"/>
         </w:rPr>
       </w:pPr>
       <w:r>
@@ -1974,7 +2321,7 @@
     <w:p>
       <w:pPr>
         <w:rPr>
-          <w:rFonts w:ascii="Times New Roman" w:hAnsi="Times New Roman" w:hint="eastAsia"/>
+          <w:rFonts w:ascii="Times New Roman" w:hAnsi="Times New Roman"/>
         </w:rPr>
       </w:pPr>
     </w:p>
@@ -2219,6 +2566,155 @@
 <file path=word/numbering.xml><?xml version="1.0" encoding="utf-8"?>
 <w:numbering xmlns:wpc="http://schemas.microsoft.com/office/word/2010/wordprocessingCanvas" xmlns:cx="http://schemas.microsoft.com/office/drawing/2014/chartex" xmlns:cx1="http://schemas.microsoft.com/office/drawing/2015/9/8/chartex" xmlns:cx2="http://schemas.microsoft.com/office/drawing/2015/10/21/chartex" xmlns:cx3="http://schemas.microsoft.com/office/drawing/2016/5/9/chartex" xmlns:cx4="http://schemas.microsoft.com/office/drawing/2016/5/10/chartex" xmlns:cx5="http://schemas.microsoft.com/office/drawing/2016/5/11/chartex" xmlns:cx6="http://schemas.microsoft.com/office/drawing/2016/5/12/chartex" xmlns:cx7="http://schemas.microsoft.com/office/drawing/2016/5/13/chartex" xmlns:cx8="http://schemas.microsoft.com/office/drawing/2016/5/14/chartex" xmlns:mc="http://schemas.openxmlformats.org/markup-compatibility/2006" xmlns:aink="http://schemas.microsoft.com/office/drawing/2016/ink" xmlns:am3d="http://schemas.microsoft.com/office/drawing/2017/model3d" xmlns:o="urn:schemas-microsoft-com:office:office" xmlns:oel="http://schemas.microsoft.com/office/2019/extlst" xmlns:r="http://schemas.openxmlformats.org/officeDocument/2006/relationships" xmlns:m="http://schemas.openxmlformats.org/officeDocument/2006/math" xmlns:v="urn:schemas-microsoft-com:vml" xmlns:wp14="http://schemas.microsoft.com/office/word/2010/wordprocessingDrawing" xmlns:wp="http://schemas.openxmlformats.org/drawingml/2006/wordprocessingDrawing" xmlns:w10="urn:schemas-microsoft-com:office:word" xmlns:w="http://schemas.openxmlformats.org/wordprocessingml/2006/main" xmlns:w14="http://schemas.microsoft.com/office/word/2010/wordml" xmlns:w15="http://schemas.microsoft.com/office/word/2012/wordml" xmlns:w16cex="http://schemas.microsoft.com/office/word/2018/wordml/cex" xmlns:w16cid="http://schemas.microsoft.com/office/word/2016/wordml/cid" xmlns:w16="http://schemas.microsoft.com/office/word/2018/wordml" xmlns:w16du="http://schemas.microsoft.com/office/word/2023/wordml/word16du" xmlns:w16sdtdh="http://schemas.microsoft.com/office/word/2020/wordml/sdtdatahash" xmlns:w16sdtfl="http://schemas.microsoft.com/office/word/2024/wordml/sdtformatlock" xmlns:w16se="http://schemas.microsoft.com/office/word/2015/wordml/symex" xmlns:wpg="http://schemas.microsoft.com/office/word/2010/wordprocessingGroup" xmlns:wpi="http://schemas.microsoft.com/office/word/2010/wordprocessingInk" xmlns:wne="http://schemas.microsoft.com/office/word/2006/wordml" xmlns:wps="http://schemas.microsoft.com/office/word/2010/wordprocessingShape" mc:Ignorable="w14 w15 w16se w16cid w16 w16cex w16sdtdh w16sdtfl w16du wp14">
   <w:abstractNum w:abstractNumId="0" w15:restartNumberingAfterBreak="0">
+    <w:nsid w:val="079C1572"/>
+    <w:multiLevelType w:val="multilevel"/>
+    <w:tmpl w:val="F4366566"/>
+    <w:lvl w:ilvl="0">
+      <w:start w:val="1"/>
+      <w:numFmt w:val="bullet"/>
+      <w:lvlText w:val=""/>
+      <w:lvlJc w:val="left"/>
+      <w:pPr>
+        <w:tabs>
+          <w:tab w:val="num" w:pos="720"/>
+        </w:tabs>
+        <w:ind w:left="720" w:hanging="360"/>
+      </w:pPr>
+      <w:rPr>
+        <w:rFonts w:ascii="Symbol" w:hAnsi="Symbol" w:hint="default"/>
+        <w:sz w:val="20"/>
+      </w:rPr>
+    </w:lvl>
+    <w:lvl w:ilvl="1" w:tentative="1">
+      <w:start w:val="1"/>
+      <w:numFmt w:val="bullet"/>
+      <w:lvlText w:val=""/>
+      <w:lvlJc w:val="left"/>
+      <w:pPr>
+        <w:tabs>
+          <w:tab w:val="num" w:pos="1440"/>
+        </w:tabs>
+        <w:ind w:left="1440" w:hanging="360"/>
+      </w:pPr>
+      <w:rPr>
+        <w:rFonts w:ascii="Symbol" w:hAnsi="Symbol" w:hint="default"/>
+        <w:sz w:val="20"/>
+      </w:rPr>
+    </w:lvl>
+    <w:lvl w:ilvl="2" w:tentative="1">
+      <w:start w:val="1"/>
+      <w:numFmt w:val="bullet"/>
+      <w:lvlText w:val=""/>
+      <w:lvlJc w:val="left"/>
+      <w:pPr>
+        <w:tabs>
+          <w:tab w:val="num" w:pos="2160"/>
+        </w:tabs>
+        <w:ind w:left="2160" w:hanging="360"/>
+      </w:pPr>
+      <w:rPr>
+        <w:rFonts w:ascii="Symbol" w:hAnsi="Symbol" w:hint="default"/>
+        <w:sz w:val="20"/>
+      </w:rPr>
+    </w:lvl>
+    <w:lvl w:ilvl="3" w:tentative="1">
+      <w:start w:val="1"/>
+      <w:numFmt w:val="bullet"/>
+      <w:lvlText w:val=""/>
+      <w:lvlJc w:val="left"/>
+      <w:pPr>
+        <w:tabs>
+          <w:tab w:val="num" w:pos="2880"/>
+        </w:tabs>
+        <w:ind w:left="2880" w:hanging="360"/>
+      </w:pPr>
+      <w:rPr>
+        <w:rFonts w:ascii="Symbol" w:hAnsi="Symbol" w:hint="default"/>
+        <w:sz w:val="20"/>
+      </w:rPr>
+    </w:lvl>
+    <w:lvl w:ilvl="4" w:tentative="1">
+      <w:start w:val="1"/>
+      <w:numFmt w:val="bullet"/>
+      <w:lvlText w:val=""/>
+      <w:lvlJc w:val="left"/>
+      <w:pPr>
+        <w:tabs>
+          <w:tab w:val="num" w:pos="3600"/>
+        </w:tabs>
+        <w:ind w:left="3600" w:hanging="360"/>
+      </w:pPr>
+      <w:rPr>
+        <w:rFonts w:ascii="Symbol" w:hAnsi="Symbol" w:hint="default"/>
+        <w:sz w:val="20"/>
+      </w:rPr>
+    </w:lvl>
+    <w:lvl w:ilvl="5" w:tentative="1">
+      <w:start w:val="1"/>
+      <w:numFmt w:val="bullet"/>
+      <w:lvlText w:val=""/>
+      <w:lvlJc w:val="left"/>
+      <w:pPr>
+        <w:tabs>
+          <w:tab w:val="num" w:pos="4320"/>
+        </w:tabs>
+        <w:ind w:left="4320" w:hanging="360"/>
+      </w:pPr>
+      <w:rPr>
+        <w:rFonts w:ascii="Symbol" w:hAnsi="Symbol" w:hint="default"/>
+        <w:sz w:val="20"/>
+      </w:rPr>
+    </w:lvl>
+    <w:lvl w:ilvl="6" w:tentative="1">
+      <w:start w:val="1"/>
+      <w:numFmt w:val="bullet"/>
+      <w:lvlText w:val=""/>
+      <w:lvlJc w:val="left"/>
+      <w:pPr>
+        <w:tabs>
+          <w:tab w:val="num" w:pos="5040"/>
+        </w:tabs>
+        <w:ind w:left="5040" w:hanging="360"/>
+      </w:pPr>
+      <w:rPr>
+        <w:rFonts w:ascii="Symbol" w:hAnsi="Symbol" w:hint="default"/>
+        <w:sz w:val="20"/>
+      </w:rPr>
+    </w:lvl>
+    <w:lvl w:ilvl="7" w:tentative="1">
+      <w:start w:val="1"/>
+      <w:numFmt w:val="bullet"/>
+      <w:lvlText w:val=""/>
+      <w:lvlJc w:val="left"/>
+      <w:pPr>
+        <w:tabs>
+          <w:tab w:val="num" w:pos="5760"/>
+        </w:tabs>
+        <w:ind w:left="5760" w:hanging="360"/>
+      </w:pPr>
+      <w:rPr>
+        <w:rFonts w:ascii="Symbol" w:hAnsi="Symbol" w:hint="default"/>
+        <w:sz w:val="20"/>
+      </w:rPr>
+    </w:lvl>
+    <w:lvl w:ilvl="8" w:tentative="1">
+      <w:start w:val="1"/>
+      <w:numFmt w:val="bullet"/>
+      <w:lvlText w:val=""/>
+      <w:lvlJc w:val="left"/>
+      <w:pPr>
+        <w:tabs>
+          <w:tab w:val="num" w:pos="6480"/>
+        </w:tabs>
+        <w:ind w:left="6480" w:hanging="360"/>
+      </w:pPr>
+      <w:rPr>
+        <w:rFonts w:ascii="Symbol" w:hAnsi="Symbol" w:hint="default"/>
+        <w:sz w:val="20"/>
+      </w:rPr>
+    </w:lvl>
+  </w:abstractNum>
+  <w:abstractNum w:abstractNumId="1" w15:restartNumberingAfterBreak="0">
     <w:nsid w:val="0905263C"/>
     <w:multiLevelType w:val="multilevel"/>
     <w:tmpl w:val="EBF6C3C0"/>
@@ -2367,7 +2863,7 @@
       </w:rPr>
     </w:lvl>
   </w:abstractNum>
-  <w:abstractNum w:abstractNumId="1" w15:restartNumberingAfterBreak="0">
+  <w:abstractNum w:abstractNumId="2" w15:restartNumberingAfterBreak="0">
     <w:nsid w:val="0C7519AC"/>
     <w:multiLevelType w:val="hybridMultilevel"/>
     <w:tmpl w:val="2B6C3A76"/>
@@ -2480,7 +2976,7 @@
       </w:rPr>
     </w:lvl>
   </w:abstractNum>
-  <w:abstractNum w:abstractNumId="2" w15:restartNumberingAfterBreak="0">
+  <w:abstractNum w:abstractNumId="3" w15:restartNumberingAfterBreak="0">
     <w:nsid w:val="11EB188F"/>
     <w:multiLevelType w:val="hybridMultilevel"/>
     <w:tmpl w:val="BCBAAF4C"/>
@@ -2593,7 +3089,7 @@
       </w:rPr>
     </w:lvl>
   </w:abstractNum>
-  <w:abstractNum w:abstractNumId="3" w15:restartNumberingAfterBreak="0">
+  <w:abstractNum w:abstractNumId="4" w15:restartNumberingAfterBreak="0">
     <w:nsid w:val="15E95210"/>
     <w:multiLevelType w:val="hybridMultilevel"/>
     <w:tmpl w:val="E6700D12"/>
@@ -2706,7 +3202,7 @@
       </w:rPr>
     </w:lvl>
   </w:abstractNum>
-  <w:abstractNum w:abstractNumId="4" w15:restartNumberingAfterBreak="0">
+  <w:abstractNum w:abstractNumId="5" w15:restartNumberingAfterBreak="0">
     <w:nsid w:val="16002367"/>
     <w:multiLevelType w:val="multilevel"/>
     <w:tmpl w:val="B05A08B8"/>
@@ -2855,7 +3351,7 @@
       </w:rPr>
     </w:lvl>
   </w:abstractNum>
-  <w:abstractNum w:abstractNumId="5" w15:restartNumberingAfterBreak="0">
+  <w:abstractNum w:abstractNumId="6" w15:restartNumberingAfterBreak="0">
     <w:nsid w:val="18652146"/>
     <w:multiLevelType w:val="hybridMultilevel"/>
     <w:tmpl w:val="7272E674"/>
@@ -2968,7 +3464,7 @@
       </w:rPr>
     </w:lvl>
   </w:abstractNum>
-  <w:abstractNum w:abstractNumId="6" w15:restartNumberingAfterBreak="0">
+  <w:abstractNum w:abstractNumId="7" w15:restartNumberingAfterBreak="0">
     <w:nsid w:val="18EA759E"/>
     <w:multiLevelType w:val="multilevel"/>
     <w:tmpl w:val="05B2E80A"/>
@@ -3117,7 +3613,7 @@
       </w:rPr>
     </w:lvl>
   </w:abstractNum>
-  <w:abstractNum w:abstractNumId="7" w15:restartNumberingAfterBreak="0">
+  <w:abstractNum w:abstractNumId="8" w15:restartNumberingAfterBreak="0">
     <w:nsid w:val="199B01DA"/>
     <w:multiLevelType w:val="multilevel"/>
     <w:tmpl w:val="65DC36F8"/>
@@ -3266,7 +3762,7 @@
       </w:rPr>
     </w:lvl>
   </w:abstractNum>
-  <w:abstractNum w:abstractNumId="8" w15:restartNumberingAfterBreak="0">
+  <w:abstractNum w:abstractNumId="9" w15:restartNumberingAfterBreak="0">
     <w:nsid w:val="1C897818"/>
     <w:multiLevelType w:val="hybridMultilevel"/>
     <w:tmpl w:val="A2842F2E"/>
@@ -3379,7 +3875,7 @@
       </w:rPr>
     </w:lvl>
   </w:abstractNum>
-  <w:abstractNum w:abstractNumId="9" w15:restartNumberingAfterBreak="0">
+  <w:abstractNum w:abstractNumId="10" w15:restartNumberingAfterBreak="0">
     <w:nsid w:val="24406CC1"/>
     <w:multiLevelType w:val="multilevel"/>
     <w:tmpl w:val="0C86CEC2"/>
@@ -3528,7 +4024,7 @@
       </w:rPr>
     </w:lvl>
   </w:abstractNum>
-  <w:abstractNum w:abstractNumId="10" w15:restartNumberingAfterBreak="0">
+  <w:abstractNum w:abstractNumId="11" w15:restartNumberingAfterBreak="0">
     <w:nsid w:val="2B354152"/>
     <w:multiLevelType w:val="hybridMultilevel"/>
     <w:tmpl w:val="5C7EC952"/>
@@ -3641,7 +4137,7 @@
       </w:rPr>
     </w:lvl>
   </w:abstractNum>
-  <w:abstractNum w:abstractNumId="11" w15:restartNumberingAfterBreak="0">
+  <w:abstractNum w:abstractNumId="12" w15:restartNumberingAfterBreak="0">
     <w:nsid w:val="350C58D8"/>
     <w:multiLevelType w:val="multilevel"/>
     <w:tmpl w:val="48ECDEBC"/>
@@ -3790,7 +4286,7 @@
       </w:rPr>
     </w:lvl>
   </w:abstractNum>
-  <w:abstractNum w:abstractNumId="12" w15:restartNumberingAfterBreak="0">
+  <w:abstractNum w:abstractNumId="13" w15:restartNumberingAfterBreak="0">
     <w:nsid w:val="36B02DC8"/>
     <w:multiLevelType w:val="hybridMultilevel"/>
     <w:tmpl w:val="FBA6C1A6"/>
@@ -3903,7 +4399,7 @@
       </w:rPr>
     </w:lvl>
   </w:abstractNum>
-  <w:abstractNum w:abstractNumId="13" w15:restartNumberingAfterBreak="0">
+  <w:abstractNum w:abstractNumId="14" w15:restartNumberingAfterBreak="0">
     <w:nsid w:val="38C223FD"/>
     <w:multiLevelType w:val="multilevel"/>
     <w:tmpl w:val="93E664FA"/>
@@ -4052,7 +4548,7 @@
       </w:rPr>
     </w:lvl>
   </w:abstractNum>
-  <w:abstractNum w:abstractNumId="14" w15:restartNumberingAfterBreak="0">
+  <w:abstractNum w:abstractNumId="15" w15:restartNumberingAfterBreak="0">
     <w:nsid w:val="38E13E39"/>
     <w:multiLevelType w:val="multilevel"/>
     <w:tmpl w:val="B0C61752"/>
@@ -4201,7 +4697,7 @@
       </w:rPr>
     </w:lvl>
   </w:abstractNum>
-  <w:abstractNum w:abstractNumId="15" w15:restartNumberingAfterBreak="0">
+  <w:abstractNum w:abstractNumId="16" w15:restartNumberingAfterBreak="0">
     <w:nsid w:val="477A5FBC"/>
     <w:multiLevelType w:val="hybridMultilevel"/>
     <w:tmpl w:val="D4B00EAE"/>
@@ -4314,7 +4810,156 @@
       </w:rPr>
     </w:lvl>
   </w:abstractNum>
-  <w:abstractNum w:abstractNumId="16" w15:restartNumberingAfterBreak="0">
+  <w:abstractNum w:abstractNumId="17" w15:restartNumberingAfterBreak="0">
+    <w:nsid w:val="492E1B3E"/>
+    <w:multiLevelType w:val="multilevel"/>
+    <w:tmpl w:val="C2AAA636"/>
+    <w:lvl w:ilvl="0">
+      <w:start w:val="1"/>
+      <w:numFmt w:val="bullet"/>
+      <w:lvlText w:val=""/>
+      <w:lvlJc w:val="left"/>
+      <w:pPr>
+        <w:tabs>
+          <w:tab w:val="num" w:pos="720"/>
+        </w:tabs>
+        <w:ind w:left="720" w:hanging="360"/>
+      </w:pPr>
+      <w:rPr>
+        <w:rFonts w:ascii="Symbol" w:hAnsi="Symbol" w:hint="default"/>
+        <w:sz w:val="20"/>
+      </w:rPr>
+    </w:lvl>
+    <w:lvl w:ilvl="1" w:tentative="1">
+      <w:start w:val="1"/>
+      <w:numFmt w:val="bullet"/>
+      <w:lvlText w:val=""/>
+      <w:lvlJc w:val="left"/>
+      <w:pPr>
+        <w:tabs>
+          <w:tab w:val="num" w:pos="1440"/>
+        </w:tabs>
+        <w:ind w:left="1440" w:hanging="360"/>
+      </w:pPr>
+      <w:rPr>
+        <w:rFonts w:ascii="Symbol" w:hAnsi="Symbol" w:hint="default"/>
+        <w:sz w:val="20"/>
+      </w:rPr>
+    </w:lvl>
+    <w:lvl w:ilvl="2" w:tentative="1">
+      <w:start w:val="1"/>
+      <w:numFmt w:val="bullet"/>
+      <w:lvlText w:val=""/>
+      <w:lvlJc w:val="left"/>
+      <w:pPr>
+        <w:tabs>
+          <w:tab w:val="num" w:pos="2160"/>
+        </w:tabs>
+        <w:ind w:left="2160" w:hanging="360"/>
+      </w:pPr>
+      <w:rPr>
+        <w:rFonts w:ascii="Symbol" w:hAnsi="Symbol" w:hint="default"/>
+        <w:sz w:val="20"/>
+      </w:rPr>
+    </w:lvl>
+    <w:lvl w:ilvl="3" w:tentative="1">
+      <w:start w:val="1"/>
+      <w:numFmt w:val="bullet"/>
+      <w:lvlText w:val=""/>
+      <w:lvlJc w:val="left"/>
+      <w:pPr>
+        <w:tabs>
+          <w:tab w:val="num" w:pos="2880"/>
+        </w:tabs>
+        <w:ind w:left="2880" w:hanging="360"/>
+      </w:pPr>
+      <w:rPr>
+        <w:rFonts w:ascii="Symbol" w:hAnsi="Symbol" w:hint="default"/>
+        <w:sz w:val="20"/>
+      </w:rPr>
+    </w:lvl>
+    <w:lvl w:ilvl="4" w:tentative="1">
+      <w:start w:val="1"/>
+      <w:numFmt w:val="bullet"/>
+      <w:lvlText w:val=""/>
+      <w:lvlJc w:val="left"/>
+      <w:pPr>
+        <w:tabs>
+          <w:tab w:val="num" w:pos="3600"/>
+        </w:tabs>
+        <w:ind w:left="3600" w:hanging="360"/>
+      </w:pPr>
+      <w:rPr>
+        <w:rFonts w:ascii="Symbol" w:hAnsi="Symbol" w:hint="default"/>
+        <w:sz w:val="20"/>
+      </w:rPr>
+    </w:lvl>
+    <w:lvl w:ilvl="5" w:tentative="1">
+      <w:start w:val="1"/>
+      <w:numFmt w:val="bullet"/>
+      <w:lvlText w:val=""/>
+      <w:lvlJc w:val="left"/>
+      <w:pPr>
+        <w:tabs>
+          <w:tab w:val="num" w:pos="4320"/>
+        </w:tabs>
+        <w:ind w:left="4320" w:hanging="360"/>
+      </w:pPr>
+      <w:rPr>
+        <w:rFonts w:ascii="Symbol" w:hAnsi="Symbol" w:hint="default"/>
+        <w:sz w:val="20"/>
+      </w:rPr>
+    </w:lvl>
+    <w:lvl w:ilvl="6" w:tentative="1">
+      <w:start w:val="1"/>
+      <w:numFmt w:val="bullet"/>
+      <w:lvlText w:val=""/>
+      <w:lvlJc w:val="left"/>
+      <w:pPr>
+        <w:tabs>
+          <w:tab w:val="num" w:pos="5040"/>
+        </w:tabs>
+        <w:ind w:left="5040" w:hanging="360"/>
+      </w:pPr>
+      <w:rPr>
+        <w:rFonts w:ascii="Symbol" w:hAnsi="Symbol" w:hint="default"/>
+        <w:sz w:val="20"/>
+      </w:rPr>
+    </w:lvl>
+    <w:lvl w:ilvl="7" w:tentative="1">
+      <w:start w:val="1"/>
+      <w:numFmt w:val="bullet"/>
+      <w:lvlText w:val=""/>
+      <w:lvlJc w:val="left"/>
+      <w:pPr>
+        <w:tabs>
+          <w:tab w:val="num" w:pos="5760"/>
+        </w:tabs>
+        <w:ind w:left="5760" w:hanging="360"/>
+      </w:pPr>
+      <w:rPr>
+        <w:rFonts w:ascii="Symbol" w:hAnsi="Symbol" w:hint="default"/>
+        <w:sz w:val="20"/>
+      </w:rPr>
+    </w:lvl>
+    <w:lvl w:ilvl="8" w:tentative="1">
+      <w:start w:val="1"/>
+      <w:numFmt w:val="bullet"/>
+      <w:lvlText w:val=""/>
+      <w:lvlJc w:val="left"/>
+      <w:pPr>
+        <w:tabs>
+          <w:tab w:val="num" w:pos="6480"/>
+        </w:tabs>
+        <w:ind w:left="6480" w:hanging="360"/>
+      </w:pPr>
+      <w:rPr>
+        <w:rFonts w:ascii="Symbol" w:hAnsi="Symbol" w:hint="default"/>
+        <w:sz w:val="20"/>
+      </w:rPr>
+    </w:lvl>
+  </w:abstractNum>
+  <w:abstractNum w:abstractNumId="18" w15:restartNumberingAfterBreak="0">
     <w:nsid w:val="4A403875"/>
     <w:multiLevelType w:val="multilevel"/>
     <w:tmpl w:val="2870C558"/>
@@ -4463,7 +5108,7 @@
       </w:rPr>
     </w:lvl>
   </w:abstractNum>
-  <w:abstractNum w:abstractNumId="17" w15:restartNumberingAfterBreak="0">
+  <w:abstractNum w:abstractNumId="19" w15:restartNumberingAfterBreak="0">
     <w:nsid w:val="56E14D99"/>
     <w:multiLevelType w:val="multilevel"/>
     <w:tmpl w:val="61509A98"/>
@@ -4612,7 +5257,7 @@
       </w:rPr>
     </w:lvl>
   </w:abstractNum>
-  <w:abstractNum w:abstractNumId="18" w15:restartNumberingAfterBreak="0">
+  <w:abstractNum w:abstractNumId="20" w15:restartNumberingAfterBreak="0">
     <w:nsid w:val="5BE4136A"/>
     <w:multiLevelType w:val="multilevel"/>
     <w:tmpl w:val="08643F4A"/>
@@ -4761,7 +5406,7 @@
       </w:rPr>
     </w:lvl>
   </w:abstractNum>
-  <w:abstractNum w:abstractNumId="19" w15:restartNumberingAfterBreak="0">
+  <w:abstractNum w:abstractNumId="21" w15:restartNumberingAfterBreak="0">
     <w:nsid w:val="65A667C1"/>
     <w:multiLevelType w:val="multilevel"/>
     <w:tmpl w:val="55C0FF7C"/>
@@ -4910,7 +5555,7 @@
       </w:rPr>
     </w:lvl>
   </w:abstractNum>
-  <w:abstractNum w:abstractNumId="20" w15:restartNumberingAfterBreak="0">
+  <w:abstractNum w:abstractNumId="22" w15:restartNumberingAfterBreak="0">
     <w:nsid w:val="67BB473E"/>
     <w:multiLevelType w:val="hybridMultilevel"/>
     <w:tmpl w:val="C63A344E"/>
@@ -5023,7 +5668,7 @@
       </w:rPr>
     </w:lvl>
   </w:abstractNum>
-  <w:abstractNum w:abstractNumId="21" w15:restartNumberingAfterBreak="0">
+  <w:abstractNum w:abstractNumId="23" w15:restartNumberingAfterBreak="0">
     <w:nsid w:val="683E72E7"/>
     <w:multiLevelType w:val="multilevel"/>
     <w:tmpl w:val="97FAFF02"/>
@@ -5172,7 +5817,156 @@
       </w:rPr>
     </w:lvl>
   </w:abstractNum>
-  <w:abstractNum w:abstractNumId="22" w15:restartNumberingAfterBreak="0">
+  <w:abstractNum w:abstractNumId="24" w15:restartNumberingAfterBreak="0">
+    <w:nsid w:val="6A5162F1"/>
+    <w:multiLevelType w:val="multilevel"/>
+    <w:tmpl w:val="ED629106"/>
+    <w:lvl w:ilvl="0">
+      <w:start w:val="1"/>
+      <w:numFmt w:val="bullet"/>
+      <w:lvlText w:val=""/>
+      <w:lvlJc w:val="left"/>
+      <w:pPr>
+        <w:tabs>
+          <w:tab w:val="num" w:pos="720"/>
+        </w:tabs>
+        <w:ind w:left="720" w:hanging="360"/>
+      </w:pPr>
+      <w:rPr>
+        <w:rFonts w:ascii="Symbol" w:hAnsi="Symbol" w:hint="default"/>
+        <w:sz w:val="20"/>
+      </w:rPr>
+    </w:lvl>
+    <w:lvl w:ilvl="1" w:tentative="1">
+      <w:start w:val="1"/>
+      <w:numFmt w:val="bullet"/>
+      <w:lvlText w:val=""/>
+      <w:lvlJc w:val="left"/>
+      <w:pPr>
+        <w:tabs>
+          <w:tab w:val="num" w:pos="1440"/>
+        </w:tabs>
+        <w:ind w:left="1440" w:hanging="360"/>
+      </w:pPr>
+      <w:rPr>
+        <w:rFonts w:ascii="Symbol" w:hAnsi="Symbol" w:hint="default"/>
+        <w:sz w:val="20"/>
+      </w:rPr>
+    </w:lvl>
+    <w:lvl w:ilvl="2" w:tentative="1">
+      <w:start w:val="1"/>
+      <w:numFmt w:val="bullet"/>
+      <w:lvlText w:val=""/>
+      <w:lvlJc w:val="left"/>
+      <w:pPr>
+        <w:tabs>
+          <w:tab w:val="num" w:pos="2160"/>
+        </w:tabs>
+        <w:ind w:left="2160" w:hanging="360"/>
+      </w:pPr>
+      <w:rPr>
+        <w:rFonts w:ascii="Symbol" w:hAnsi="Symbol" w:hint="default"/>
+        <w:sz w:val="20"/>
+      </w:rPr>
+    </w:lvl>
+    <w:lvl w:ilvl="3" w:tentative="1">
+      <w:start w:val="1"/>
+      <w:numFmt w:val="bullet"/>
+      <w:lvlText w:val=""/>
+      <w:lvlJc w:val="left"/>
+      <w:pPr>
+        <w:tabs>
+          <w:tab w:val="num" w:pos="2880"/>
+        </w:tabs>
+        <w:ind w:left="2880" w:hanging="360"/>
+      </w:pPr>
+      <w:rPr>
+        <w:rFonts w:ascii="Symbol" w:hAnsi="Symbol" w:hint="default"/>
+        <w:sz w:val="20"/>
+      </w:rPr>
+    </w:lvl>
+    <w:lvl w:ilvl="4" w:tentative="1">
+      <w:start w:val="1"/>
+      <w:numFmt w:val="bullet"/>
+      <w:lvlText w:val=""/>
+      <w:lvlJc w:val="left"/>
+      <w:pPr>
+        <w:tabs>
+          <w:tab w:val="num" w:pos="3600"/>
+        </w:tabs>
+        <w:ind w:left="3600" w:hanging="360"/>
+      </w:pPr>
+      <w:rPr>
+        <w:rFonts w:ascii="Symbol" w:hAnsi="Symbol" w:hint="default"/>
+        <w:sz w:val="20"/>
+      </w:rPr>
+    </w:lvl>
+    <w:lvl w:ilvl="5" w:tentative="1">
+      <w:start w:val="1"/>
+      <w:numFmt w:val="bullet"/>
+      <w:lvlText w:val=""/>
+      <w:lvlJc w:val="left"/>
+      <w:pPr>
+        <w:tabs>
+          <w:tab w:val="num" w:pos="4320"/>
+        </w:tabs>
+        <w:ind w:left="4320" w:hanging="360"/>
+      </w:pPr>
+      <w:rPr>
+        <w:rFonts w:ascii="Symbol" w:hAnsi="Symbol" w:hint="default"/>
+        <w:sz w:val="20"/>
+      </w:rPr>
+    </w:lvl>
+    <w:lvl w:ilvl="6" w:tentative="1">
+      <w:start w:val="1"/>
+      <w:numFmt w:val="bullet"/>
+      <w:lvlText w:val=""/>
+      <w:lvlJc w:val="left"/>
+      <w:pPr>
+        <w:tabs>
+          <w:tab w:val="num" w:pos="5040"/>
+        </w:tabs>
+        <w:ind w:left="5040" w:hanging="360"/>
+      </w:pPr>
+      <w:rPr>
+        <w:rFonts w:ascii="Symbol" w:hAnsi="Symbol" w:hint="default"/>
+        <w:sz w:val="20"/>
+      </w:rPr>
+    </w:lvl>
+    <w:lvl w:ilvl="7" w:tentative="1">
+      <w:start w:val="1"/>
+      <w:numFmt w:val="bullet"/>
+      <w:lvlText w:val=""/>
+      <w:lvlJc w:val="left"/>
+      <w:pPr>
+        <w:tabs>
+          <w:tab w:val="num" w:pos="5760"/>
+        </w:tabs>
+        <w:ind w:left="5760" w:hanging="360"/>
+      </w:pPr>
+      <w:rPr>
+        <w:rFonts w:ascii="Symbol" w:hAnsi="Symbol" w:hint="default"/>
+        <w:sz w:val="20"/>
+      </w:rPr>
+    </w:lvl>
+    <w:lvl w:ilvl="8" w:tentative="1">
+      <w:start w:val="1"/>
+      <w:numFmt w:val="bullet"/>
+      <w:lvlText w:val=""/>
+      <w:lvlJc w:val="left"/>
+      <w:pPr>
+        <w:tabs>
+          <w:tab w:val="num" w:pos="6480"/>
+        </w:tabs>
+        <w:ind w:left="6480" w:hanging="360"/>
+      </w:pPr>
+      <w:rPr>
+        <w:rFonts w:ascii="Symbol" w:hAnsi="Symbol" w:hint="default"/>
+        <w:sz w:val="20"/>
+      </w:rPr>
+    </w:lvl>
+  </w:abstractNum>
+  <w:abstractNum w:abstractNumId="25" w15:restartNumberingAfterBreak="0">
     <w:nsid w:val="6A587E4D"/>
     <w:multiLevelType w:val="multilevel"/>
     <w:tmpl w:val="2B5A67CE"/>
@@ -5321,7 +6115,7 @@
       </w:rPr>
     </w:lvl>
   </w:abstractNum>
-  <w:abstractNum w:abstractNumId="23" w15:restartNumberingAfterBreak="0">
+  <w:abstractNum w:abstractNumId="26" w15:restartNumberingAfterBreak="0">
     <w:nsid w:val="6B64231D"/>
     <w:multiLevelType w:val="multilevel"/>
     <w:tmpl w:val="8B802068"/>
@@ -5470,7 +6264,7 @@
       </w:rPr>
     </w:lvl>
   </w:abstractNum>
-  <w:abstractNum w:abstractNumId="24" w15:restartNumberingAfterBreak="0">
+  <w:abstractNum w:abstractNumId="27" w15:restartNumberingAfterBreak="0">
     <w:nsid w:val="6C8A2732"/>
     <w:multiLevelType w:val="multilevel"/>
     <w:tmpl w:val="AC68A2F6"/>
@@ -5619,7 +6413,7 @@
       </w:rPr>
     </w:lvl>
   </w:abstractNum>
-  <w:abstractNum w:abstractNumId="25" w15:restartNumberingAfterBreak="0">
+  <w:abstractNum w:abstractNumId="28" w15:restartNumberingAfterBreak="0">
     <w:nsid w:val="77FB185F"/>
     <w:multiLevelType w:val="multilevel"/>
     <w:tmpl w:val="4A0AC68C"/>
@@ -5768,7 +6562,7 @@
       </w:rPr>
     </w:lvl>
   </w:abstractNum>
-  <w:abstractNum w:abstractNumId="26" w15:restartNumberingAfterBreak="0">
+  <w:abstractNum w:abstractNumId="29" w15:restartNumberingAfterBreak="0">
     <w:nsid w:val="78CC0F42"/>
     <w:multiLevelType w:val="hybridMultilevel"/>
     <w:tmpl w:val="FF0E469E"/>
@@ -5881,7 +6675,7 @@
       </w:rPr>
     </w:lvl>
   </w:abstractNum>
-  <w:abstractNum w:abstractNumId="27" w15:restartNumberingAfterBreak="0">
+  <w:abstractNum w:abstractNumId="30" w15:restartNumberingAfterBreak="0">
     <w:nsid w:val="7FDB4FBB"/>
     <w:multiLevelType w:val="hybridMultilevel"/>
     <w:tmpl w:val="02888A14"/>
@@ -5995,40 +6789,40 @@
     </w:lvl>
   </w:abstractNum>
   <w:num w:numId="1" w16cid:durableId="1534076626">
-    <w:abstractNumId w:val="12"/>
+    <w:abstractNumId w:val="13"/>
   </w:num>
   <w:num w:numId="2" w16cid:durableId="2072803160">
-    <w:abstractNumId w:val="27"/>
+    <w:abstractNumId w:val="30"/>
   </w:num>
   <w:num w:numId="3" w16cid:durableId="2080209827">
+    <w:abstractNumId w:val="4"/>
+  </w:num>
+  <w:num w:numId="4" w16cid:durableId="1281766440">
+    <w:abstractNumId w:val="22"/>
+  </w:num>
+  <w:num w:numId="5" w16cid:durableId="1624265293">
+    <w:abstractNumId w:val="16"/>
+  </w:num>
+  <w:num w:numId="6" w16cid:durableId="1300106917">
+    <w:abstractNumId w:val="2"/>
+  </w:num>
+  <w:num w:numId="7" w16cid:durableId="1047680920">
+    <w:abstractNumId w:val="29"/>
+  </w:num>
+  <w:num w:numId="8" w16cid:durableId="2128356627">
     <w:abstractNumId w:val="3"/>
   </w:num>
-  <w:num w:numId="4" w16cid:durableId="1281766440">
-    <w:abstractNumId w:val="20"/>
-  </w:num>
-  <w:num w:numId="5" w16cid:durableId="1624265293">
-    <w:abstractNumId w:val="15"/>
-  </w:num>
-  <w:num w:numId="6" w16cid:durableId="1300106917">
-    <w:abstractNumId w:val="1"/>
-  </w:num>
-  <w:num w:numId="7" w16cid:durableId="1047680920">
-    <w:abstractNumId w:val="26"/>
-  </w:num>
-  <w:num w:numId="8" w16cid:durableId="2128356627">
-    <w:abstractNumId w:val="2"/>
-  </w:num>
   <w:num w:numId="9" w16cid:durableId="424112662">
-    <w:abstractNumId w:val="5"/>
+    <w:abstractNumId w:val="6"/>
   </w:num>
   <w:num w:numId="10" w16cid:durableId="1302537564">
-    <w:abstractNumId w:val="8"/>
+    <w:abstractNumId w:val="9"/>
   </w:num>
   <w:num w:numId="11" w16cid:durableId="298995045">
-    <w:abstractNumId w:val="10"/>
+    <w:abstractNumId w:val="11"/>
   </w:num>
   <w:num w:numId="12" w16cid:durableId="2077773555">
-    <w:abstractNumId w:val="21"/>
+    <w:abstractNumId w:val="23"/>
     <w:lvlOverride w:ilvl="0">
       <w:lvl w:ilvl="0">
         <w:numFmt w:val="bullet"/>
@@ -6048,7 +6842,7 @@
     </w:lvlOverride>
   </w:num>
   <w:num w:numId="13" w16cid:durableId="449008073">
-    <w:abstractNumId w:val="0"/>
+    <w:abstractNumId w:val="1"/>
     <w:lvlOverride w:ilvl="0">
       <w:lvl w:ilvl="0">
         <w:numFmt w:val="bullet"/>
@@ -6068,7 +6862,7 @@
     </w:lvlOverride>
   </w:num>
   <w:num w:numId="14" w16cid:durableId="622998333">
-    <w:abstractNumId w:val="0"/>
+    <w:abstractNumId w:val="1"/>
     <w:lvlOverride w:ilvl="0">
       <w:lvl w:ilvl="0">
         <w:numFmt w:val="bullet"/>
@@ -6088,7 +6882,7 @@
     </w:lvlOverride>
   </w:num>
   <w:num w:numId="15" w16cid:durableId="398406055">
-    <w:abstractNumId w:val="0"/>
+    <w:abstractNumId w:val="1"/>
     <w:lvlOverride w:ilvl="0">
       <w:lvl w:ilvl="0">
         <w:numFmt w:val="bullet"/>
@@ -6108,7 +6902,7 @@
     </w:lvlOverride>
   </w:num>
   <w:num w:numId="16" w16cid:durableId="1432513067">
-    <w:abstractNumId w:val="0"/>
+    <w:abstractNumId w:val="1"/>
     <w:lvlOverride w:ilvl="0">
       <w:lvl w:ilvl="0">
         <w:numFmt w:val="bullet"/>
@@ -6128,49 +6922,58 @@
     </w:lvlOverride>
   </w:num>
   <w:num w:numId="17" w16cid:durableId="904026505">
-    <w:abstractNumId w:val="16"/>
+    <w:abstractNumId w:val="18"/>
   </w:num>
   <w:num w:numId="18" w16cid:durableId="340282183">
-    <w:abstractNumId w:val="13"/>
+    <w:abstractNumId w:val="14"/>
   </w:num>
   <w:num w:numId="19" w16cid:durableId="2037266661">
-    <w:abstractNumId w:val="4"/>
+    <w:abstractNumId w:val="5"/>
   </w:num>
   <w:num w:numId="20" w16cid:durableId="2103991406">
+    <w:abstractNumId w:val="21"/>
+  </w:num>
+  <w:num w:numId="21" w16cid:durableId="556010877">
+    <w:abstractNumId w:val="27"/>
+  </w:num>
+  <w:num w:numId="22" w16cid:durableId="809052474">
+    <w:abstractNumId w:val="7"/>
+  </w:num>
+  <w:num w:numId="23" w16cid:durableId="424304058">
     <w:abstractNumId w:val="19"/>
   </w:num>
-  <w:num w:numId="21" w16cid:durableId="556010877">
+  <w:num w:numId="24" w16cid:durableId="1011025623">
+    <w:abstractNumId w:val="28"/>
+  </w:num>
+  <w:num w:numId="25" w16cid:durableId="610160920">
+    <w:abstractNumId w:val="20"/>
+  </w:num>
+  <w:num w:numId="26" w16cid:durableId="927232695">
+    <w:abstractNumId w:val="10"/>
+  </w:num>
+  <w:num w:numId="27" w16cid:durableId="1941838475">
+    <w:abstractNumId w:val="25"/>
+  </w:num>
+  <w:num w:numId="28" w16cid:durableId="1338456429">
+    <w:abstractNumId w:val="26"/>
+  </w:num>
+  <w:num w:numId="29" w16cid:durableId="208492009">
+    <w:abstractNumId w:val="15"/>
+  </w:num>
+  <w:num w:numId="30" w16cid:durableId="154304151">
+    <w:abstractNumId w:val="8"/>
+  </w:num>
+  <w:num w:numId="31" w16cid:durableId="1034378793">
+    <w:abstractNumId w:val="12"/>
+  </w:num>
+  <w:num w:numId="32" w16cid:durableId="195587833">
+    <w:abstractNumId w:val="17"/>
+  </w:num>
+  <w:num w:numId="33" w16cid:durableId="410153395">
     <w:abstractNumId w:val="24"/>
   </w:num>
-  <w:num w:numId="22" w16cid:durableId="809052474">
-    <w:abstractNumId w:val="6"/>
-  </w:num>
-  <w:num w:numId="23" w16cid:durableId="424304058">
-    <w:abstractNumId w:val="17"/>
-  </w:num>
-  <w:num w:numId="24" w16cid:durableId="1011025623">
-    <w:abstractNumId w:val="25"/>
-  </w:num>
-  <w:num w:numId="25" w16cid:durableId="610160920">
-    <w:abstractNumId w:val="18"/>
-  </w:num>
-  <w:num w:numId="26" w16cid:durableId="927232695">
-    <w:abstractNumId w:val="9"/>
-  </w:num>
-  <w:num w:numId="27" w16cid:durableId="1941838475">
-    <w:abstractNumId w:val="22"/>
-  </w:num>
-  <w:num w:numId="28" w16cid:durableId="1338456429">
-    <w:abstractNumId w:val="23"/>
-  </w:num>
-  <w:num w:numId="29" w16cid:durableId="208492009">
-    <w:abstractNumId w:val="14"/>
-  </w:num>
-  <w:num w:numId="30" w16cid:durableId="154304151">
-    <w:abstractNumId w:val="7"/>
-  </w:num>
-  <w:num w:numId="31" w16cid:durableId="1034378793">
-    <w:abstractNumId w:val="11"/>
+  <w:num w:numId="34" w16cid:durableId="1292173489">
+    <w:abstractNumId w:val="0"/>
   </w:num>
 </w:numbering>
 </file>

</xml_diff>